<commit_message>
Switch to Ollama Cloud (gemma4:31b-cloud), add image capture + vision
</commit_message>
<xml_diff>
--- a/SELF_HOSTING_GUIDE.docx
+++ b/SELF_HOSTING_GUIDE.docx
@@ -2,7 +2,7 @@
 <file path=word/document.xml><?xml version="1.0" encoding="utf-8"?>
 <w:document xmlns:w="http://schemas.openxmlformats.org/wordprocessingml/2006/main" xmlns:m="http://schemas.openxmlformats.org/officeDocument/2006/math" xmlns:r="http://schemas.openxmlformats.org/officeDocument/2006/relationships" xmlns:o="urn:schemas-microsoft-com:office:office" xmlns:v="urn:schemas-microsoft-com:vml" xmlns:w10="urn:schemas-microsoft-com:office:word" xmlns:a="http://schemas.openxmlformats.org/drawingml/2006/main" xmlns:pic="http://schemas.openxmlformats.org/drawingml/2006/picture" xmlns:wp="http://schemas.openxmlformats.org/drawingml/2006/wordprocessingDrawing">
   <w:body>
-    <w:bookmarkStart w:id="40" w:name="X86b893c4ccdfd50ac08838a4a594088d5c89b0e"/>
+    <w:bookmarkStart w:id="38" w:name="X86b893c4ccdfd50ac08838a4a594088d5c89b0e"/>
     <w:p>
       <w:pPr>
         <w:pStyle w:val="Heading1"/>
@@ -1176,25 +1176,16 @@
         <w:rPr>
           <w:rStyle w:val="VerbatimChar"/>
         </w:rPr>
-        <w:t xml:space="preserve"># === LLM API (see section 5 for options) ===</w:t>
-      </w:r>
-      <w:r>
-        <w:br/>
-      </w:r>
-      <w:r>
-        <w:rPr>
-          <w:rStyle w:val="VerbatimChar"/>
-        </w:rPr>
-        <w:t xml:space="preserve">OPENAI_API_KEY="sk-your-openai-api-key"</w:t>
-      </w:r>
-      <w:r>
-        <w:br/>
-      </w:r>
-      <w:r>
-        <w:rPr>
-          <w:rStyle w:val="VerbatimChar"/>
-        </w:rPr>
-        <w:t xml:space="preserve">OPENAI_BASE_URL="https://api.openai.com/v1"</w:t>
+        <w:t xml:space="preserve"># === LLM API (Ollama Cloud — gemma4:31b-cloud with vision) ===</w:t>
+      </w:r>
+      <w:r>
+        <w:br/>
+      </w:r>
+      <w:r>
+        <w:rPr>
+          <w:rStyle w:val="VerbatimChar"/>
+        </w:rPr>
+        <w:t xml:space="preserve">OLLAMA_API_KEY="your-ollama-api-key"</w:t>
       </w:r>
       <w:r>
         <w:br/>
@@ -1322,13 +1313,13 @@
       </w:r>
     </w:p>
     <w:bookmarkEnd w:id="24"/>
-    <w:bookmarkStart w:id="28" w:name="llm-api-what-needs-to-change"/>
+    <w:bookmarkStart w:id="26" w:name="X3c93f6a829ef36dda3ec0a6ebf6fc6cb8a584af"/>
     <w:p>
       <w:pPr>
         <w:pStyle w:val="Heading2"/>
       </w:pPr>
       <w:r>
-        <w:t xml:space="preserve">5. LLM API — What Needs to Change</w:t>
+        <w:t xml:space="preserve">5. LLM API — Already Configured for Ollama Cloud</w:t>
       </w:r>
     </w:p>
     <w:p>
@@ -1336,22 +1327,153 @@
         <w:pStyle w:val="FirstParagraph"/>
       </w:pPr>
       <w:r>
-        <w:t xml:space="preserve">The app currently calls the Abacus AI LLM endpoint. You need to switch it to OpenAI (or any OpenAI-compatible provider like Anthropic via a proxy, OpenRouter, etc.).</w:t>
-      </w:r>
-    </w:p>
-    <w:p>
-      <w:pPr>
-        <w:pStyle w:val="BodyText"/>
-      </w:pPr>
+        <w:t xml:space="preserve">The app is already configured to use</w:t>
+      </w:r>
+      <w:r>
+        <w:t xml:space="preserve"> </w:t>
+      </w:r>
       <w:r>
         <w:rPr>
           <w:bCs/>
           <w:b/>
         </w:rPr>
-        <w:t xml:space="preserve">Files to modify:</w:t>
-      </w:r>
-    </w:p>
-    <w:bookmarkStart w:id="25" w:name="appapichatroute.ts-line-529"/>
+        <w:t xml:space="preserve">Ollama Cloud</w:t>
+      </w:r>
+      <w:r>
+        <w:t xml:space="preserve"> </w:t>
+      </w:r>
+      <w:r>
+        <w:t xml:space="preserve">with the</w:t>
+      </w:r>
+      <w:r>
+        <w:t xml:space="preserve"> </w:t>
+      </w:r>
+      <w:r>
+        <w:rPr>
+          <w:rStyle w:val="VerbatimChar"/>
+        </w:rPr>
+        <w:t xml:space="preserve">gemma4:31b-cloud</w:t>
+      </w:r>
+      <w:r>
+        <w:t xml:space="preserve"> </w:t>
+      </w:r>
+      <w:r>
+        <w:t xml:space="preserve">model (which has vision support for image analysis). Both the chat and doctor-summary routes point to</w:t>
+      </w:r>
+      <w:r>
+        <w:t xml:space="preserve"> </w:t>
+      </w:r>
+      <w:r>
+        <w:rPr>
+          <w:rStyle w:val="VerbatimChar"/>
+        </w:rPr>
+        <w:t xml:space="preserve">https://ollama.com/v1/chat/completions</w:t>
+      </w:r>
+      <w:r>
+        <w:t xml:space="preserve">.</w:t>
+      </w:r>
+    </w:p>
+    <w:p>
+      <w:pPr>
+        <w:pStyle w:val="BodyText"/>
+      </w:pPr>
+      <w:r>
+        <w:t xml:space="preserve">Just set your</w:t>
+      </w:r>
+      <w:r>
+        <w:t xml:space="preserve"> </w:t>
+      </w:r>
+      <w:r>
+        <w:rPr>
+          <w:rStyle w:val="VerbatimChar"/>
+        </w:rPr>
+        <w:t xml:space="preserve">OLLAMA_API_KEY</w:t>
+      </w:r>
+      <w:r>
+        <w:t xml:space="preserve"> </w:t>
+      </w:r>
+      <w:r>
+        <w:t xml:space="preserve">in the</w:t>
+      </w:r>
+      <w:r>
+        <w:t xml:space="preserve"> </w:t>
+      </w:r>
+      <w:r>
+        <w:rPr>
+          <w:rStyle w:val="VerbatimChar"/>
+        </w:rPr>
+        <w:t xml:space="preserve">.env</w:t>
+      </w:r>
+      <w:r>
+        <w:t xml:space="preserve"> </w:t>
+      </w:r>
+      <w:r>
+        <w:t xml:space="preserve">file and you’re good to go.</w:t>
+      </w:r>
+    </w:p>
+    <w:p>
+      <w:pPr>
+        <w:pStyle w:val="BodyText"/>
+      </w:pPr>
+      <w:r>
+        <w:t xml:space="preserve">If you ever want to switch to OpenAI or another provider, change the URL in two files:</w:t>
+      </w:r>
+      <w:r>
+        <w:t xml:space="preserve"> </w:t>
+      </w:r>
+      <w:r>
+        <w:t xml:space="preserve">-</w:t>
+      </w:r>
+      <w:r>
+        <w:t xml:space="preserve"> </w:t>
+      </w:r>
+      <w:r>
+        <w:rPr>
+          <w:rStyle w:val="VerbatimChar"/>
+        </w:rPr>
+        <w:t xml:space="preserve">app/api/chat/route.ts</w:t>
+      </w:r>
+      <w:r>
+        <w:t xml:space="preserve"> </w:t>
+      </w:r>
+      <w:r>
+        <w:t xml:space="preserve">(search for</w:t>
+      </w:r>
+      <w:r>
+        <w:t xml:space="preserve"> </w:t>
+      </w:r>
+      <w:r>
+        <w:rPr>
+          <w:rStyle w:val="VerbatimChar"/>
+        </w:rPr>
+        <w:t xml:space="preserve">ollama.com/v1</w:t>
+      </w:r>
+      <w:r>
+        <w:t xml:space="preserve">)</w:t>
+      </w:r>
+      <w:r>
+        <w:t xml:space="preserve"> </w:t>
+      </w:r>
+      <w:r>
+        <w:t xml:space="preserve">-</w:t>
+      </w:r>
+      <w:r>
+        <w:t xml:space="preserve"> </w:t>
+      </w:r>
+      <w:r>
+        <w:rPr>
+          <w:rStyle w:val="VerbatimChar"/>
+        </w:rPr>
+        <w:t xml:space="preserve">app/api/reports/doctor-summary/route.ts</w:t>
+      </w:r>
+      <w:r>
+        <w:t xml:space="preserve"> </w:t>
+      </w:r>
+      <w:r>
+        <w:t xml:space="preserve">(same search)</w:t>
+      </w:r>
+    </w:p>
+    <w:bookmarkStart w:id="25" w:name="applayout.tsx"/>
     <w:p>
       <w:pPr>
         <w:pStyle w:val="Heading3"/>
@@ -1360,13 +1482,7 @@
         <w:rPr>
           <w:rStyle w:val="VerbatimChar"/>
         </w:rPr>
-        <w:t xml:space="preserve">app/api/chat/route.ts</w:t>
-      </w:r>
-      <w:r>
-        <w:t xml:space="preserve"> </w:t>
-      </w:r>
-      <w:r>
-        <w:t xml:space="preserve">(line ~529)</w:t>
+        <w:t xml:space="preserve">app/layout.tsx</w:t>
       </w:r>
     </w:p>
     <w:p>
@@ -1374,841 +1490,7 @@
         <w:pStyle w:val="FirstParagraph"/>
       </w:pPr>
       <w:r>
-        <w:t xml:space="preserve">Change:</w:t>
-      </w:r>
-    </w:p>
-    <w:p>
-      <w:pPr>
-        <w:pStyle w:val="SourceCode"/>
-      </w:pPr>
-      <w:r>
-        <w:rPr>
-          <w:rStyle w:val="KeywordTok"/>
-        </w:rPr>
-        <w:t xml:space="preserve">const</w:t>
-      </w:r>
-      <w:r>
-        <w:rPr>
-          <w:rStyle w:val="NormalTok"/>
-        </w:rPr>
-        <w:t xml:space="preserve"> response </w:t>
-      </w:r>
-      <w:r>
-        <w:rPr>
-          <w:rStyle w:val="OperatorTok"/>
-        </w:rPr>
-        <w:t xml:space="preserve">=</w:t>
-      </w:r>
-      <w:r>
-        <w:rPr>
-          <w:rStyle w:val="NormalTok"/>
-        </w:rPr>
-        <w:t xml:space="preserve"> </w:t>
-      </w:r>
-      <w:r>
-        <w:rPr>
-          <w:rStyle w:val="ControlFlowTok"/>
-        </w:rPr>
-        <w:t xml:space="preserve">await</w:t>
-      </w:r>
-      <w:r>
-        <w:rPr>
-          <w:rStyle w:val="NormalTok"/>
-        </w:rPr>
-        <w:t xml:space="preserve"> </w:t>
-      </w:r>
-      <w:r>
-        <w:rPr>
-          <w:rStyle w:val="FunctionTok"/>
-        </w:rPr>
-        <w:t xml:space="preserve">fetch</w:t>
-      </w:r>
-      <w:r>
-        <w:rPr>
-          <w:rStyle w:val="NormalTok"/>
-        </w:rPr>
-        <w:t xml:space="preserve">(</w:t>
-      </w:r>
-      <w:r>
-        <w:rPr>
-          <w:rStyle w:val="StringTok"/>
-        </w:rPr>
-        <w:t xml:space="preserve">'https://apps.abacus.ai/v1/chat/completions'</w:t>
-      </w:r>
-      <w:r>
-        <w:rPr>
-          <w:rStyle w:val="OperatorTok"/>
-        </w:rPr>
-        <w:t xml:space="preserve">,</w:t>
-      </w:r>
-      <w:r>
-        <w:rPr>
-          <w:rStyle w:val="NormalTok"/>
-        </w:rPr>
-        <w:t xml:space="preserve"> {</w:t>
-      </w:r>
-      <w:r>
-        <w:br/>
-      </w:r>
-      <w:r>
-        <w:rPr>
-          <w:rStyle w:val="NormalTok"/>
-        </w:rPr>
-        <w:t xml:space="preserve">  method</w:t>
-      </w:r>
-      <w:r>
-        <w:rPr>
-          <w:rStyle w:val="OperatorTok"/>
-        </w:rPr>
-        <w:t xml:space="preserve">:</w:t>
-      </w:r>
-      <w:r>
-        <w:rPr>
-          <w:rStyle w:val="NormalTok"/>
-        </w:rPr>
-        <w:t xml:space="preserve"> </w:t>
-      </w:r>
-      <w:r>
-        <w:rPr>
-          <w:rStyle w:val="StringTok"/>
-        </w:rPr>
-        <w:t xml:space="preserve">'POST'</w:t>
-      </w:r>
-      <w:r>
-        <w:rPr>
-          <w:rStyle w:val="OperatorTok"/>
-        </w:rPr>
-        <w:t xml:space="preserve">,</w:t>
-      </w:r>
-      <w:r>
-        <w:br/>
-      </w:r>
-      <w:r>
-        <w:rPr>
-          <w:rStyle w:val="NormalTok"/>
-        </w:rPr>
-        <w:t xml:space="preserve">  headers</w:t>
-      </w:r>
-      <w:r>
-        <w:rPr>
-          <w:rStyle w:val="OperatorTok"/>
-        </w:rPr>
-        <w:t xml:space="preserve">:</w:t>
-      </w:r>
-      <w:r>
-        <w:rPr>
-          <w:rStyle w:val="NormalTok"/>
-        </w:rPr>
-        <w:t xml:space="preserve"> {</w:t>
-      </w:r>
-      <w:r>
-        <w:br/>
-      </w:r>
-      <w:r>
-        <w:rPr>
-          <w:rStyle w:val="NormalTok"/>
-        </w:rPr>
-        <w:t xml:space="preserve">    </w:t>
-      </w:r>
-      <w:r>
-        <w:rPr>
-          <w:rStyle w:val="StringTok"/>
-        </w:rPr>
-        <w:t xml:space="preserve">'Content-Type'</w:t>
-      </w:r>
-      <w:r>
-        <w:rPr>
-          <w:rStyle w:val="OperatorTok"/>
-        </w:rPr>
-        <w:t xml:space="preserve">:</w:t>
-      </w:r>
-      <w:r>
-        <w:rPr>
-          <w:rStyle w:val="NormalTok"/>
-        </w:rPr>
-        <w:t xml:space="preserve"> </w:t>
-      </w:r>
-      <w:r>
-        <w:rPr>
-          <w:rStyle w:val="StringTok"/>
-        </w:rPr>
-        <w:t xml:space="preserve">'application/json'</w:t>
-      </w:r>
-      <w:r>
-        <w:rPr>
-          <w:rStyle w:val="OperatorTok"/>
-        </w:rPr>
-        <w:t xml:space="preserve">,</w:t>
-      </w:r>
-      <w:r>
-        <w:br/>
-      </w:r>
-      <w:r>
-        <w:rPr>
-          <w:rStyle w:val="NormalTok"/>
-        </w:rPr>
-        <w:t xml:space="preserve">    </w:t>
-      </w:r>
-      <w:r>
-        <w:rPr>
-          <w:rStyle w:val="StringTok"/>
-        </w:rPr>
-        <w:t xml:space="preserve">'Authorization'</w:t>
-      </w:r>
-      <w:r>
-        <w:rPr>
-          <w:rStyle w:val="OperatorTok"/>
-        </w:rPr>
-        <w:t xml:space="preserve">:</w:t>
-      </w:r>
-      <w:r>
-        <w:rPr>
-          <w:rStyle w:val="NormalTok"/>
-        </w:rPr>
-        <w:t xml:space="preserve"> </w:t>
-      </w:r>
-      <w:r>
-        <w:rPr>
-          <w:rStyle w:val="VerbatimStringTok"/>
-        </w:rPr>
-        <w:t xml:space="preserve">`Bearer </w:t>
-      </w:r>
-      <w:r>
-        <w:rPr>
-          <w:rStyle w:val="SpecialCharTok"/>
-        </w:rPr>
-        <w:t xml:space="preserve">${</w:t>
-      </w:r>
-      <w:r>
-        <w:rPr>
-          <w:rStyle w:val="BuiltInTok"/>
-        </w:rPr>
-        <w:t xml:space="preserve">process</w:t>
-      </w:r>
-      <w:r>
-        <w:rPr>
-          <w:rStyle w:val="OperatorTok"/>
-        </w:rPr>
-        <w:t xml:space="preserve">.</w:t>
-      </w:r>
-      <w:r>
-        <w:rPr>
-          <w:rStyle w:val="AttributeTok"/>
-        </w:rPr>
-        <w:t xml:space="preserve">env</w:t>
-      </w:r>
-      <w:r>
-        <w:rPr>
-          <w:rStyle w:val="OperatorTok"/>
-        </w:rPr>
-        <w:t xml:space="preserve">.</w:t>
-      </w:r>
-      <w:r>
-        <w:rPr>
-          <w:rStyle w:val="AttributeTok"/>
-        </w:rPr>
-        <w:t xml:space="preserve">ABACUSAI_API_KEY</w:t>
-      </w:r>
-      <w:r>
-        <w:rPr>
-          <w:rStyle w:val="SpecialCharTok"/>
-        </w:rPr>
-        <w:t xml:space="preserve">}</w:t>
-      </w:r>
-      <w:r>
-        <w:rPr>
-          <w:rStyle w:val="VerbatimStringTok"/>
-        </w:rPr>
-        <w:t xml:space="preserve">`</w:t>
-      </w:r>
-      <w:r>
-        <w:rPr>
-          <w:rStyle w:val="OperatorTok"/>
-        </w:rPr>
-        <w:t xml:space="preserve">,</w:t>
-      </w:r>
-      <w:r>
-        <w:br/>
-      </w:r>
-      <w:r>
-        <w:rPr>
-          <w:rStyle w:val="NormalTok"/>
-        </w:rPr>
-        <w:t xml:space="preserve">  }</w:t>
-      </w:r>
-      <w:r>
-        <w:rPr>
-          <w:rStyle w:val="OperatorTok"/>
-        </w:rPr>
-        <w:t xml:space="preserve">,</w:t>
-      </w:r>
-      <w:r>
-        <w:br/>
-      </w:r>
-      <w:r>
-        <w:rPr>
-          <w:rStyle w:val="NormalTok"/>
-        </w:rPr>
-        <w:t xml:space="preserve">  body</w:t>
-      </w:r>
-      <w:r>
-        <w:rPr>
-          <w:rStyle w:val="OperatorTok"/>
-        </w:rPr>
-        <w:t xml:space="preserve">:</w:t>
-      </w:r>
-      <w:r>
-        <w:rPr>
-          <w:rStyle w:val="NormalTok"/>
-        </w:rPr>
-        <w:t xml:space="preserve"> </w:t>
-      </w:r>
-      <w:r>
-        <w:rPr>
-          <w:rStyle w:val="BuiltInTok"/>
-        </w:rPr>
-        <w:t xml:space="preserve">JSON</w:t>
-      </w:r>
-      <w:r>
-        <w:rPr>
-          <w:rStyle w:val="OperatorTok"/>
-        </w:rPr>
-        <w:t xml:space="preserve">.</w:t>
-      </w:r>
-      <w:r>
-        <w:rPr>
-          <w:rStyle w:val="FunctionTok"/>
-        </w:rPr>
-        <w:t xml:space="preserve">stringify</w:t>
-      </w:r>
-      <w:r>
-        <w:rPr>
-          <w:rStyle w:val="NormalTok"/>
-        </w:rPr>
-        <w:t xml:space="preserve">({</w:t>
-      </w:r>
-      <w:r>
-        <w:br/>
-      </w:r>
-      <w:r>
-        <w:rPr>
-          <w:rStyle w:val="NormalTok"/>
-        </w:rPr>
-        <w:t xml:space="preserve">    model</w:t>
-      </w:r>
-      <w:r>
-        <w:rPr>
-          <w:rStyle w:val="OperatorTok"/>
-        </w:rPr>
-        <w:t xml:space="preserve">:</w:t>
-      </w:r>
-      <w:r>
-        <w:rPr>
-          <w:rStyle w:val="NormalTok"/>
-        </w:rPr>
-        <w:t xml:space="preserve"> </w:t>
-      </w:r>
-      <w:r>
-        <w:rPr>
-          <w:rStyle w:val="StringTok"/>
-        </w:rPr>
-        <w:t xml:space="preserve">'claude-sonnet-4-6'</w:t>
-      </w:r>
-      <w:r>
-        <w:rPr>
-          <w:rStyle w:val="OperatorTok"/>
-        </w:rPr>
-        <w:t xml:space="preserve">,</w:t>
-      </w:r>
-    </w:p>
-    <w:p>
-      <w:pPr>
-        <w:pStyle w:val="FirstParagraph"/>
-      </w:pPr>
-      <w:r>
-        <w:t xml:space="preserve">To:</w:t>
-      </w:r>
-    </w:p>
-    <w:p>
-      <w:pPr>
-        <w:pStyle w:val="SourceCode"/>
-      </w:pPr>
-      <w:r>
-        <w:rPr>
-          <w:rStyle w:val="KeywordTok"/>
-        </w:rPr>
-        <w:t xml:space="preserve">const</w:t>
-      </w:r>
-      <w:r>
-        <w:rPr>
-          <w:rStyle w:val="NormalTok"/>
-        </w:rPr>
-        <w:t xml:space="preserve"> response </w:t>
-      </w:r>
-      <w:r>
-        <w:rPr>
-          <w:rStyle w:val="OperatorTok"/>
-        </w:rPr>
-        <w:t xml:space="preserve">=</w:t>
-      </w:r>
-      <w:r>
-        <w:rPr>
-          <w:rStyle w:val="NormalTok"/>
-        </w:rPr>
-        <w:t xml:space="preserve"> </w:t>
-      </w:r>
-      <w:r>
-        <w:rPr>
-          <w:rStyle w:val="ControlFlowTok"/>
-        </w:rPr>
-        <w:t xml:space="preserve">await</w:t>
-      </w:r>
-      <w:r>
-        <w:rPr>
-          <w:rStyle w:val="NormalTok"/>
-        </w:rPr>
-        <w:t xml:space="preserve"> </w:t>
-      </w:r>
-      <w:r>
-        <w:rPr>
-          <w:rStyle w:val="FunctionTok"/>
-        </w:rPr>
-        <w:t xml:space="preserve">fetch</w:t>
-      </w:r>
-      <w:r>
-        <w:rPr>
-          <w:rStyle w:val="NormalTok"/>
-        </w:rPr>
-        <w:t xml:space="preserve">(</w:t>
-      </w:r>
-      <w:r>
-        <w:rPr>
-          <w:rStyle w:val="VerbatimStringTok"/>
-        </w:rPr>
-        <w:t xml:space="preserve">`</w:t>
-      </w:r>
-      <w:r>
-        <w:rPr>
-          <w:rStyle w:val="SpecialCharTok"/>
-        </w:rPr>
-        <w:t xml:space="preserve">${</w:t>
-      </w:r>
-      <w:r>
-        <w:rPr>
-          <w:rStyle w:val="BuiltInTok"/>
-        </w:rPr>
-        <w:t xml:space="preserve">process</w:t>
-      </w:r>
-      <w:r>
-        <w:rPr>
-          <w:rStyle w:val="OperatorTok"/>
-        </w:rPr>
-        <w:t xml:space="preserve">.</w:t>
-      </w:r>
-      <w:r>
-        <w:rPr>
-          <w:rStyle w:val="AttributeTok"/>
-        </w:rPr>
-        <w:t xml:space="preserve">env</w:t>
-      </w:r>
-      <w:r>
-        <w:rPr>
-          <w:rStyle w:val="OperatorTok"/>
-        </w:rPr>
-        <w:t xml:space="preserve">.</w:t>
-      </w:r>
-      <w:r>
-        <w:rPr>
-          <w:rStyle w:val="AttributeTok"/>
-        </w:rPr>
-        <w:t xml:space="preserve">OPENAI_BASE_URL</w:t>
-      </w:r>
-      <w:r>
-        <w:rPr>
-          <w:rStyle w:val="SpecialCharTok"/>
-        </w:rPr>
-        <w:t xml:space="preserve">}</w:t>
-      </w:r>
-      <w:r>
-        <w:rPr>
-          <w:rStyle w:val="VerbatimStringTok"/>
-        </w:rPr>
-        <w:t xml:space="preserve">/chat/completions`</w:t>
-      </w:r>
-      <w:r>
-        <w:rPr>
-          <w:rStyle w:val="OperatorTok"/>
-        </w:rPr>
-        <w:t xml:space="preserve">,</w:t>
-      </w:r>
-      <w:r>
-        <w:rPr>
-          <w:rStyle w:val="NormalTok"/>
-        </w:rPr>
-        <w:t xml:space="preserve"> {</w:t>
-      </w:r>
-      <w:r>
-        <w:br/>
-      </w:r>
-      <w:r>
-        <w:rPr>
-          <w:rStyle w:val="NormalTok"/>
-        </w:rPr>
-        <w:t xml:space="preserve">  method</w:t>
-      </w:r>
-      <w:r>
-        <w:rPr>
-          <w:rStyle w:val="OperatorTok"/>
-        </w:rPr>
-        <w:t xml:space="preserve">:</w:t>
-      </w:r>
-      <w:r>
-        <w:rPr>
-          <w:rStyle w:val="NormalTok"/>
-        </w:rPr>
-        <w:t xml:space="preserve"> </w:t>
-      </w:r>
-      <w:r>
-        <w:rPr>
-          <w:rStyle w:val="StringTok"/>
-        </w:rPr>
-        <w:t xml:space="preserve">'POST'</w:t>
-      </w:r>
-      <w:r>
-        <w:rPr>
-          <w:rStyle w:val="OperatorTok"/>
-        </w:rPr>
-        <w:t xml:space="preserve">,</w:t>
-      </w:r>
-      <w:r>
-        <w:br/>
-      </w:r>
-      <w:r>
-        <w:rPr>
-          <w:rStyle w:val="NormalTok"/>
-        </w:rPr>
-        <w:t xml:space="preserve">  headers</w:t>
-      </w:r>
-      <w:r>
-        <w:rPr>
-          <w:rStyle w:val="OperatorTok"/>
-        </w:rPr>
-        <w:t xml:space="preserve">:</w:t>
-      </w:r>
-      <w:r>
-        <w:rPr>
-          <w:rStyle w:val="NormalTok"/>
-        </w:rPr>
-        <w:t xml:space="preserve"> {</w:t>
-      </w:r>
-      <w:r>
-        <w:br/>
-      </w:r>
-      <w:r>
-        <w:rPr>
-          <w:rStyle w:val="NormalTok"/>
-        </w:rPr>
-        <w:t xml:space="preserve">    </w:t>
-      </w:r>
-      <w:r>
-        <w:rPr>
-          <w:rStyle w:val="StringTok"/>
-        </w:rPr>
-        <w:t xml:space="preserve">'Content-Type'</w:t>
-      </w:r>
-      <w:r>
-        <w:rPr>
-          <w:rStyle w:val="OperatorTok"/>
-        </w:rPr>
-        <w:t xml:space="preserve">:</w:t>
-      </w:r>
-      <w:r>
-        <w:rPr>
-          <w:rStyle w:val="NormalTok"/>
-        </w:rPr>
-        <w:t xml:space="preserve"> </w:t>
-      </w:r>
-      <w:r>
-        <w:rPr>
-          <w:rStyle w:val="StringTok"/>
-        </w:rPr>
-        <w:t xml:space="preserve">'application/json'</w:t>
-      </w:r>
-      <w:r>
-        <w:rPr>
-          <w:rStyle w:val="OperatorTok"/>
-        </w:rPr>
-        <w:t xml:space="preserve">,</w:t>
-      </w:r>
-      <w:r>
-        <w:br/>
-      </w:r>
-      <w:r>
-        <w:rPr>
-          <w:rStyle w:val="NormalTok"/>
-        </w:rPr>
-        <w:t xml:space="preserve">    </w:t>
-      </w:r>
-      <w:r>
-        <w:rPr>
-          <w:rStyle w:val="StringTok"/>
-        </w:rPr>
-        <w:t xml:space="preserve">'Authorization'</w:t>
-      </w:r>
-      <w:r>
-        <w:rPr>
-          <w:rStyle w:val="OperatorTok"/>
-        </w:rPr>
-        <w:t xml:space="preserve">:</w:t>
-      </w:r>
-      <w:r>
-        <w:rPr>
-          <w:rStyle w:val="NormalTok"/>
-        </w:rPr>
-        <w:t xml:space="preserve"> </w:t>
-      </w:r>
-      <w:r>
-        <w:rPr>
-          <w:rStyle w:val="VerbatimStringTok"/>
-        </w:rPr>
-        <w:t xml:space="preserve">`Bearer </w:t>
-      </w:r>
-      <w:r>
-        <w:rPr>
-          <w:rStyle w:val="SpecialCharTok"/>
-        </w:rPr>
-        <w:t xml:space="preserve">${</w:t>
-      </w:r>
-      <w:r>
-        <w:rPr>
-          <w:rStyle w:val="BuiltInTok"/>
-        </w:rPr>
-        <w:t xml:space="preserve">process</w:t>
-      </w:r>
-      <w:r>
-        <w:rPr>
-          <w:rStyle w:val="OperatorTok"/>
-        </w:rPr>
-        <w:t xml:space="preserve">.</w:t>
-      </w:r>
-      <w:r>
-        <w:rPr>
-          <w:rStyle w:val="AttributeTok"/>
-        </w:rPr>
-        <w:t xml:space="preserve">env</w:t>
-      </w:r>
-      <w:r>
-        <w:rPr>
-          <w:rStyle w:val="OperatorTok"/>
-        </w:rPr>
-        <w:t xml:space="preserve">.</w:t>
-      </w:r>
-      <w:r>
-        <w:rPr>
-          <w:rStyle w:val="AttributeTok"/>
-        </w:rPr>
-        <w:t xml:space="preserve">OPENAI_API_KEY</w:t>
-      </w:r>
-      <w:r>
-        <w:rPr>
-          <w:rStyle w:val="SpecialCharTok"/>
-        </w:rPr>
-        <w:t xml:space="preserve">}</w:t>
-      </w:r>
-      <w:r>
-        <w:rPr>
-          <w:rStyle w:val="VerbatimStringTok"/>
-        </w:rPr>
-        <w:t xml:space="preserve">`</w:t>
-      </w:r>
-      <w:r>
-        <w:rPr>
-          <w:rStyle w:val="OperatorTok"/>
-        </w:rPr>
-        <w:t xml:space="preserve">,</w:t>
-      </w:r>
-      <w:r>
-        <w:br/>
-      </w:r>
-      <w:r>
-        <w:rPr>
-          <w:rStyle w:val="NormalTok"/>
-        </w:rPr>
-        <w:t xml:space="preserve">  }</w:t>
-      </w:r>
-      <w:r>
-        <w:rPr>
-          <w:rStyle w:val="OperatorTok"/>
-        </w:rPr>
-        <w:t xml:space="preserve">,</w:t>
-      </w:r>
-      <w:r>
-        <w:br/>
-      </w:r>
-      <w:r>
-        <w:rPr>
-          <w:rStyle w:val="NormalTok"/>
-        </w:rPr>
-        <w:t xml:space="preserve">  body</w:t>
-      </w:r>
-      <w:r>
-        <w:rPr>
-          <w:rStyle w:val="OperatorTok"/>
-        </w:rPr>
-        <w:t xml:space="preserve">:</w:t>
-      </w:r>
-      <w:r>
-        <w:rPr>
-          <w:rStyle w:val="NormalTok"/>
-        </w:rPr>
-        <w:t xml:space="preserve"> </w:t>
-      </w:r>
-      <w:r>
-        <w:rPr>
-          <w:rStyle w:val="BuiltInTok"/>
-        </w:rPr>
-        <w:t xml:space="preserve">JSON</w:t>
-      </w:r>
-      <w:r>
-        <w:rPr>
-          <w:rStyle w:val="OperatorTok"/>
-        </w:rPr>
-        <w:t xml:space="preserve">.</w:t>
-      </w:r>
-      <w:r>
-        <w:rPr>
-          <w:rStyle w:val="FunctionTok"/>
-        </w:rPr>
-        <w:t xml:space="preserve">stringify</w:t>
-      </w:r>
-      <w:r>
-        <w:rPr>
-          <w:rStyle w:val="NormalTok"/>
-        </w:rPr>
-        <w:t xml:space="preserve">({</w:t>
-      </w:r>
-      <w:r>
-        <w:br/>
-      </w:r>
-      <w:r>
-        <w:rPr>
-          <w:rStyle w:val="NormalTok"/>
-        </w:rPr>
-        <w:t xml:space="preserve">    model</w:t>
-      </w:r>
-      <w:r>
-        <w:rPr>
-          <w:rStyle w:val="OperatorTok"/>
-        </w:rPr>
-        <w:t xml:space="preserve">:</w:t>
-      </w:r>
-      <w:r>
-        <w:rPr>
-          <w:rStyle w:val="NormalTok"/>
-        </w:rPr>
-        <w:t xml:space="preserve"> </w:t>
-      </w:r>
-      <w:r>
-        <w:rPr>
-          <w:rStyle w:val="StringTok"/>
-        </w:rPr>
-        <w:t xml:space="preserve">'gpt-4o'</w:t>
-      </w:r>
-      <w:r>
-        <w:rPr>
-          <w:rStyle w:val="OperatorTok"/>
-        </w:rPr>
-        <w:t xml:space="preserve">,</w:t>
-      </w:r>
-      <w:r>
-        <w:rPr>
-          <w:rStyle w:val="NormalTok"/>
-        </w:rPr>
-        <w:t xml:space="preserve">  </w:t>
-      </w:r>
-      <w:r>
-        <w:rPr>
-          <w:rStyle w:val="CommentTok"/>
-        </w:rPr>
-        <w:t xml:space="preserve">// or your preferred model</w:t>
-      </w:r>
-    </w:p>
-    <w:bookmarkEnd w:id="25"/>
-    <w:bookmarkStart w:id="26" w:name="Xa37790ffde45f4a5e4906be6589a233a39f6f4b"/>
-    <w:p>
-      <w:pPr>
-        <w:pStyle w:val="Heading3"/>
-      </w:pPr>
-      <w:r>
-        <w:rPr>
-          <w:rStyle w:val="VerbatimChar"/>
-        </w:rPr>
-        <w:t xml:space="preserve">app/api/reports/doctor-summary/route.ts</w:t>
-      </w:r>
-      <w:r>
-        <w:t xml:space="preserve"> </w:t>
-      </w:r>
-      <w:r>
-        <w:t xml:space="preserve">(line ~69)</w:t>
-      </w:r>
-    </w:p>
-    <w:p>
-      <w:pPr>
-        <w:pStyle w:val="FirstParagraph"/>
-      </w:pPr>
-      <w:r>
-        <w:t xml:space="preserve">Same change — replace the Abacus URL/key with your OpenAI ones, and change the model from</w:t>
-      </w:r>
-      <w:r>
-        <w:t xml:space="preserve"> </w:t>
-      </w:r>
-      <w:r>
-        <w:rPr>
-          <w:rStyle w:val="VerbatimChar"/>
-        </w:rPr>
-        <w:t xml:space="preserve">gpt-5.4-mini</w:t>
-      </w:r>
-      <w:r>
-        <w:t xml:space="preserve"> </w:t>
-      </w:r>
-      <w:r>
-        <w:t xml:space="preserve">to</w:t>
-      </w:r>
-      <w:r>
-        <w:t xml:space="preserve"> </w:t>
-      </w:r>
-      <w:r>
-        <w:rPr>
-          <w:rStyle w:val="VerbatimChar"/>
-        </w:rPr>
-        <w:t xml:space="preserve">gpt-4o-mini</w:t>
-      </w:r>
-      <w:r>
-        <w:t xml:space="preserve"> </w:t>
-      </w:r>
-      <w:r>
-        <w:t xml:space="preserve">(or similar).</w:t>
-      </w:r>
-    </w:p>
-    <w:bookmarkEnd w:id="26"/>
-    <w:bookmarkStart w:id="27" w:name="applayout.tsx"/>
-    <w:p>
-      <w:pPr>
-        <w:pStyle w:val="Heading3"/>
-      </w:pPr>
-      <w:r>
-        <w:rPr>
-          <w:rStyle w:val="VerbatimChar"/>
-        </w:rPr>
-        <w:t xml:space="preserve">app/layout.tsx</w:t>
-      </w:r>
-    </w:p>
-    <w:p>
-      <w:pPr>
-        <w:pStyle w:val="FirstParagraph"/>
-      </w:pPr>
-      <w:r>
-        <w:t xml:space="preserve">Remove this line (it’s an Abacus-specific script):</w:t>
+        <w:t xml:space="preserve">Remove this line (it’s a platform-specific script, harmless but unnecessary):</w:t>
       </w:r>
     </w:p>
     <w:p>
@@ -2259,80 +1541,80 @@
         </w:pict>
       </w:r>
     </w:p>
+    <w:bookmarkEnd w:id="25"/>
+    <w:bookmarkEnd w:id="26"/>
+    <w:bookmarkStart w:id="30" w:name="email-what-needs-to-change"/>
+    <w:p>
+      <w:pPr>
+        <w:pStyle w:val="Heading2"/>
+      </w:pPr>
+      <w:r>
+        <w:t xml:space="preserve">6. Email — What Needs to Change</w:t>
+      </w:r>
+    </w:p>
+    <w:p>
+      <w:pPr>
+        <w:pStyle w:val="FirstParagraph"/>
+      </w:pPr>
+      <w:r>
+        <w:t xml:space="preserve">The app currently uses the Abacus AI notification API for emails. You need to replace it with a standard SMTP approach (Nodemailer).</w:t>
+      </w:r>
+    </w:p>
+    <w:bookmarkStart w:id="27" w:name="install-nodemailer"/>
+    <w:p>
+      <w:pPr>
+        <w:pStyle w:val="Heading3"/>
+      </w:pPr>
+      <w:r>
+        <w:t xml:space="preserve">Install Nodemailer:</w:t>
+      </w:r>
+    </w:p>
+    <w:p>
+      <w:pPr>
+        <w:pStyle w:val="SourceCode"/>
+      </w:pPr>
+      <w:r>
+        <w:rPr>
+          <w:rStyle w:val="ExtensionTok"/>
+        </w:rPr>
+        <w:t xml:space="preserve">yarn</w:t>
+      </w:r>
+      <w:r>
+        <w:rPr>
+          <w:rStyle w:val="NormalTok"/>
+        </w:rPr>
+        <w:t xml:space="preserve"> add nodemailer</w:t>
+      </w:r>
+      <w:r>
+        <w:br/>
+      </w:r>
+      <w:r>
+        <w:rPr>
+          <w:rStyle w:val="ExtensionTok"/>
+        </w:rPr>
+        <w:t xml:space="preserve">yarn</w:t>
+      </w:r>
+      <w:r>
+        <w:rPr>
+          <w:rStyle w:val="NormalTok"/>
+        </w:rPr>
+        <w:t xml:space="preserve"> add </w:t>
+      </w:r>
+      <w:r>
+        <w:rPr>
+          <w:rStyle w:val="AttributeTok"/>
+        </w:rPr>
+        <w:t xml:space="preserve">-D</w:t>
+      </w:r>
+      <w:r>
+        <w:rPr>
+          <w:rStyle w:val="NormalTok"/>
+        </w:rPr>
+        <w:t xml:space="preserve"> @types/nodemailer</w:t>
+      </w:r>
+    </w:p>
     <w:bookmarkEnd w:id="27"/>
-    <w:bookmarkEnd w:id="28"/>
-    <w:bookmarkStart w:id="32" w:name="email-what-needs-to-change"/>
-    <w:p>
-      <w:pPr>
-        <w:pStyle w:val="Heading2"/>
-      </w:pPr>
-      <w:r>
-        <w:t xml:space="preserve">6. Email — What Needs to Change</w:t>
-      </w:r>
-    </w:p>
-    <w:p>
-      <w:pPr>
-        <w:pStyle w:val="FirstParagraph"/>
-      </w:pPr>
-      <w:r>
-        <w:t xml:space="preserve">The app currently uses the Abacus AI notification API for emails. You need to replace it with a standard SMTP approach (Nodemailer).</w:t>
-      </w:r>
-    </w:p>
-    <w:bookmarkStart w:id="29" w:name="install-nodemailer"/>
-    <w:p>
-      <w:pPr>
-        <w:pStyle w:val="Heading3"/>
-      </w:pPr>
-      <w:r>
-        <w:t xml:space="preserve">Install Nodemailer:</w:t>
-      </w:r>
-    </w:p>
-    <w:p>
-      <w:pPr>
-        <w:pStyle w:val="SourceCode"/>
-      </w:pPr>
-      <w:r>
-        <w:rPr>
-          <w:rStyle w:val="ExtensionTok"/>
-        </w:rPr>
-        <w:t xml:space="preserve">yarn</w:t>
-      </w:r>
-      <w:r>
-        <w:rPr>
-          <w:rStyle w:val="NormalTok"/>
-        </w:rPr>
-        <w:t xml:space="preserve"> add nodemailer</w:t>
-      </w:r>
-      <w:r>
-        <w:br/>
-      </w:r>
-      <w:r>
-        <w:rPr>
-          <w:rStyle w:val="ExtensionTok"/>
-        </w:rPr>
-        <w:t xml:space="preserve">yarn</w:t>
-      </w:r>
-      <w:r>
-        <w:rPr>
-          <w:rStyle w:val="NormalTok"/>
-        </w:rPr>
-        <w:t xml:space="preserve"> add </w:t>
-      </w:r>
-      <w:r>
-        <w:rPr>
-          <w:rStyle w:val="AttributeTok"/>
-        </w:rPr>
-        <w:t xml:space="preserve">-D</w:t>
-      </w:r>
-      <w:r>
-        <w:rPr>
-          <w:rStyle w:val="NormalTok"/>
-        </w:rPr>
-        <w:t xml:space="preserve"> @types/nodemailer</w:t>
-      </w:r>
-    </w:p>
-    <w:bookmarkEnd w:id="29"/>
-    <w:bookmarkStart w:id="31" w:name="replace-appapiemail-summaryroute.ts"/>
+    <w:bookmarkStart w:id="29" w:name="replace-appapiemail-summaryroute.ts"/>
     <w:p>
       <w:pPr>
         <w:pStyle w:val="Heading3"/>
@@ -3088,7 +2370,7 @@
       <w:r>
         <w:t xml:space="preserve"> </w:t>
       </w:r>
-      <w:hyperlink r:id="rId30">
+      <w:hyperlink r:id="rId28">
         <w:r>
           <w:rPr>
             <w:rStyle w:val="Hyperlink"/>
@@ -3110,9 +2392,9 @@
         </w:pict>
       </w:r>
     </w:p>
-    <w:bookmarkEnd w:id="31"/>
-    <w:bookmarkEnd w:id="32"/>
-    <w:bookmarkStart w:id="33" w:name="push-notification-cron-jobs"/>
+    <w:bookmarkEnd w:id="29"/>
+    <w:bookmarkEnd w:id="30"/>
+    <w:bookmarkStart w:id="31" w:name="push-notification-cron-jobs"/>
     <w:p>
       <w:pPr>
         <w:pStyle w:val="Heading2"/>
@@ -3254,8 +2536,8 @@
         </w:pict>
       </w:r>
     </w:p>
-    <w:bookmarkEnd w:id="33"/>
-    <w:bookmarkStart w:id="34" w:name="nginx-reverse-proxy-https"/>
+    <w:bookmarkEnd w:id="31"/>
+    <w:bookmarkStart w:id="32" w:name="nginx-reverse-proxy-https"/>
     <w:p>
       <w:pPr>
         <w:pStyle w:val="Heading2"/>
@@ -3588,8 +2870,8 @@
         </w:pict>
       </w:r>
     </w:p>
-    <w:bookmarkEnd w:id="34"/>
-    <w:bookmarkStart w:id="35" w:name="prisma-schema-fix-output-path"/>
+    <w:bookmarkEnd w:id="32"/>
+    <w:bookmarkStart w:id="33" w:name="prisma-schema-fix-output-path"/>
     <w:p>
       <w:pPr>
         <w:pStyle w:val="Heading2"/>
@@ -3698,8 +2980,8 @@
         </w:pict>
       </w:r>
     </w:p>
-    <w:bookmarkEnd w:id="35"/>
-    <w:bookmarkStart w:id="36" w:name="next.config.js-simplify"/>
+    <w:bookmarkEnd w:id="33"/>
+    <w:bookmarkStart w:id="34" w:name="next.config.js-simplify"/>
     <w:p>
       <w:pPr>
         <w:pStyle w:val="Heading2"/>
@@ -4085,8 +3367,8 @@
         </w:pict>
       </w:r>
     </w:p>
-    <w:bookmarkEnd w:id="36"/>
-    <w:bookmarkStart w:id="37" w:name="summary-of-changes-needed"/>
+    <w:bookmarkEnd w:id="34"/>
+    <w:bookmarkStart w:id="35" w:name="summary-of-changes-needed"/>
     <w:p>
       <w:pPr>
         <w:pStyle w:val="Heading2"/>
@@ -4171,7 +3453,7 @@
               <w:rPr>
                 <w:rStyle w:val="VerbatimChar"/>
               </w:rPr>
-              <w:t xml:space="preserve">apps.abacus.ai/v1/chat/completions</w:t>
+              <w:t xml:space="preserve">ollama.com/v1/chat/completions</w:t>
             </w:r>
           </w:p>
         </w:tc>
@@ -4183,7 +3465,7 @@
               <w:jc w:val="left"/>
             </w:pPr>
             <w:r>
-              <w:t xml:space="preserve">OpenAI / OpenRouter / any OpenAI-compatible</w:t>
+              <w:t xml:space="preserve">Already configured for Ollama Cloud</w:t>
             </w:r>
           </w:p>
         </w:tc>
@@ -4197,7 +3479,7 @@
               <w:jc w:val="left"/>
             </w:pPr>
             <w:r>
-              <w:t xml:space="preserve">LLM models</w:t>
+              <w:t xml:space="preserve">LLM model</w:t>
             </w:r>
           </w:p>
         </w:tc>
@@ -4212,19 +3494,7 @@
               <w:rPr>
                 <w:rStyle w:val="VerbatimChar"/>
               </w:rPr>
-              <w:t xml:space="preserve">claude-sonnet-4-6</w:t>
-            </w:r>
-            <w:r>
-              <w:t xml:space="preserve">,</w:t>
-            </w:r>
-            <w:r>
-              <w:t xml:space="preserve"> </w:t>
-            </w:r>
-            <w:r>
-              <w:rPr>
-                <w:rStyle w:val="VerbatimChar"/>
-              </w:rPr>
-              <w:t xml:space="preserve">gpt-5.4-mini</w:t>
+              <w:t xml:space="preserve">gemma4:31b-cloud</w:t>
             </w:r>
           </w:p>
         </w:tc>
@@ -4236,28 +3506,7 @@
               <w:jc w:val="left"/>
             </w:pPr>
             <w:r>
-              <w:rPr>
-                <w:rStyle w:val="VerbatimChar"/>
-              </w:rPr>
-              <w:t xml:space="preserve">gpt-4o</w:t>
-            </w:r>
-            <w:r>
-              <w:t xml:space="preserve">,</w:t>
-            </w:r>
-            <w:r>
-              <w:t xml:space="preserve"> </w:t>
-            </w:r>
-            <w:r>
-              <w:rPr>
-                <w:rStyle w:val="VerbatimChar"/>
-              </w:rPr>
-              <w:t xml:space="preserve">gpt-4o-mini</w:t>
-            </w:r>
-            <w:r>
-              <w:t xml:space="preserve"> </w:t>
-            </w:r>
-            <w:r>
-              <w:t xml:space="preserve">(or equivalent)</w:t>
+              <w:t xml:space="preserve">Already configured (vision-capable)</w:t>
             </w:r>
           </w:p>
         </w:tc>
@@ -4560,8 +3809,8 @@
         </w:pict>
       </w:r>
     </w:p>
-    <w:bookmarkEnd w:id="37"/>
-    <w:bookmarkStart w:id="38" w:name="hostinger-dns-setup"/>
+    <w:bookmarkEnd w:id="35"/>
+    <w:bookmarkStart w:id="36" w:name="hostinger-dns-setup"/>
     <w:p>
       <w:pPr>
         <w:pStyle w:val="Heading2"/>
@@ -4691,190 +3940,190 @@
         </w:pict>
       </w:r>
     </w:p>
+    <w:bookmarkEnd w:id="36"/>
+    <w:bookmarkStart w:id="37" w:name="ongoing-maintenance"/>
+    <w:p>
+      <w:pPr>
+        <w:pStyle w:val="Heading2"/>
+      </w:pPr>
+      <w:r>
+        <w:t xml:space="preserve">Ongoing Maintenance</w:t>
+      </w:r>
+    </w:p>
+    <w:p>
+      <w:pPr>
+        <w:pStyle w:val="SourceCode"/>
+      </w:pPr>
+      <w:r>
+        <w:rPr>
+          <w:rStyle w:val="CommentTok"/>
+        </w:rPr>
+        <w:t xml:space="preserve"># View logs</w:t>
+      </w:r>
+      <w:r>
+        <w:br/>
+      </w:r>
+      <w:r>
+        <w:rPr>
+          <w:rStyle w:val="ExtensionTok"/>
+        </w:rPr>
+        <w:t xml:space="preserve">pm2</w:t>
+      </w:r>
+      <w:r>
+        <w:rPr>
+          <w:rStyle w:val="NormalTok"/>
+        </w:rPr>
+        <w:t xml:space="preserve"> logs health-logger</w:t>
+      </w:r>
+      <w:r>
+        <w:br/>
+      </w:r>
+      <w:r>
+        <w:br/>
+      </w:r>
+      <w:r>
+        <w:rPr>
+          <w:rStyle w:val="CommentTok"/>
+        </w:rPr>
+        <w:t xml:space="preserve"># Restart after code changes</w:t>
+      </w:r>
+      <w:r>
+        <w:br/>
+      </w:r>
+      <w:r>
+        <w:rPr>
+          <w:rStyle w:val="BuiltInTok"/>
+        </w:rPr>
+        <w:t xml:space="preserve">cd</w:t>
+      </w:r>
+      <w:r>
+        <w:rPr>
+          <w:rStyle w:val="NormalTok"/>
+        </w:rPr>
+        <w:t xml:space="preserve"> /var/www/health-logger</w:t>
+      </w:r>
+      <w:r>
+        <w:br/>
+      </w:r>
+      <w:r>
+        <w:rPr>
+          <w:rStyle w:val="ExtensionTok"/>
+        </w:rPr>
+        <w:t xml:space="preserve">yarn</w:t>
+      </w:r>
+      <w:r>
+        <w:rPr>
+          <w:rStyle w:val="NormalTok"/>
+        </w:rPr>
+        <w:t xml:space="preserve"> build</w:t>
+      </w:r>
+      <w:r>
+        <w:br/>
+      </w:r>
+      <w:r>
+        <w:rPr>
+          <w:rStyle w:val="ExtensionTok"/>
+        </w:rPr>
+        <w:t xml:space="preserve">pm2</w:t>
+      </w:r>
+      <w:r>
+        <w:rPr>
+          <w:rStyle w:val="NormalTok"/>
+        </w:rPr>
+        <w:t xml:space="preserve"> restart health-logger</w:t>
+      </w:r>
+      <w:r>
+        <w:br/>
+      </w:r>
+      <w:r>
+        <w:br/>
+      </w:r>
+      <w:r>
+        <w:rPr>
+          <w:rStyle w:val="CommentTok"/>
+        </w:rPr>
+        <w:t xml:space="preserve"># Database backup (set up as a daily cron)</w:t>
+      </w:r>
+      <w:r>
+        <w:br/>
+      </w:r>
+      <w:r>
+        <w:rPr>
+          <w:rStyle w:val="ExtensionTok"/>
+        </w:rPr>
+        <w:t xml:space="preserve">pg_dump</w:t>
+      </w:r>
+      <w:r>
+        <w:rPr>
+          <w:rStyle w:val="NormalTok"/>
+        </w:rPr>
+        <w:t xml:space="preserve"> </w:t>
+      </w:r>
+      <w:r>
+        <w:rPr>
+          <w:rStyle w:val="AttributeTok"/>
+        </w:rPr>
+        <w:t xml:space="preserve">-U</w:t>
+      </w:r>
+      <w:r>
+        <w:rPr>
+          <w:rStyle w:val="NormalTok"/>
+        </w:rPr>
+        <w:t xml:space="preserve"> healthlogger healthlogger </w:t>
+      </w:r>
+      <w:r>
+        <w:rPr>
+          <w:rStyle w:val="OperatorTok"/>
+        </w:rPr>
+        <w:t xml:space="preserve">&gt;</w:t>
+      </w:r>
+      <w:r>
+        <w:rPr>
+          <w:rStyle w:val="NormalTok"/>
+        </w:rPr>
+        <w:t xml:space="preserve"> /backups/healthlogger_</w:t>
+      </w:r>
+      <w:r>
+        <w:rPr>
+          <w:rStyle w:val="VariableTok"/>
+        </w:rPr>
+        <w:t xml:space="preserve">$(</w:t>
+      </w:r>
+      <w:r>
+        <w:rPr>
+          <w:rStyle w:val="FunctionTok"/>
+        </w:rPr>
+        <w:t xml:space="preserve">date</w:t>
+      </w:r>
+      <w:r>
+        <w:rPr>
+          <w:rStyle w:val="NormalTok"/>
+        </w:rPr>
+        <w:t xml:space="preserve"> +%Y%m%d</w:t>
+      </w:r>
+      <w:r>
+        <w:rPr>
+          <w:rStyle w:val="VariableTok"/>
+        </w:rPr>
+        <w:t xml:space="preserve">)</w:t>
+      </w:r>
+      <w:r>
+        <w:rPr>
+          <w:rStyle w:val="NormalTok"/>
+        </w:rPr>
+        <w:t xml:space="preserve">.sql</w:t>
+      </w:r>
+    </w:p>
+    <w:p>
+      <w:pPr>
+        <w:pStyle w:val="FirstParagraph"/>
+      </w:pPr>
+      <w:r>
+        <w:t xml:space="preserve">That’s it! 🎉</w:t>
+      </w:r>
+    </w:p>
+    <w:bookmarkEnd w:id="37"/>
     <w:bookmarkEnd w:id="38"/>
-    <w:bookmarkStart w:id="39" w:name="ongoing-maintenance"/>
-    <w:p>
-      <w:pPr>
-        <w:pStyle w:val="Heading2"/>
-      </w:pPr>
-      <w:r>
-        <w:t xml:space="preserve">Ongoing Maintenance</w:t>
-      </w:r>
-    </w:p>
-    <w:p>
-      <w:pPr>
-        <w:pStyle w:val="SourceCode"/>
-      </w:pPr>
-      <w:r>
-        <w:rPr>
-          <w:rStyle w:val="CommentTok"/>
-        </w:rPr>
-        <w:t xml:space="preserve"># View logs</w:t>
-      </w:r>
-      <w:r>
-        <w:br/>
-      </w:r>
-      <w:r>
-        <w:rPr>
-          <w:rStyle w:val="ExtensionTok"/>
-        </w:rPr>
-        <w:t xml:space="preserve">pm2</w:t>
-      </w:r>
-      <w:r>
-        <w:rPr>
-          <w:rStyle w:val="NormalTok"/>
-        </w:rPr>
-        <w:t xml:space="preserve"> logs health-logger</w:t>
-      </w:r>
-      <w:r>
-        <w:br/>
-      </w:r>
-      <w:r>
-        <w:br/>
-      </w:r>
-      <w:r>
-        <w:rPr>
-          <w:rStyle w:val="CommentTok"/>
-        </w:rPr>
-        <w:t xml:space="preserve"># Restart after code changes</w:t>
-      </w:r>
-      <w:r>
-        <w:br/>
-      </w:r>
-      <w:r>
-        <w:rPr>
-          <w:rStyle w:val="BuiltInTok"/>
-        </w:rPr>
-        <w:t xml:space="preserve">cd</w:t>
-      </w:r>
-      <w:r>
-        <w:rPr>
-          <w:rStyle w:val="NormalTok"/>
-        </w:rPr>
-        <w:t xml:space="preserve"> /var/www/health-logger</w:t>
-      </w:r>
-      <w:r>
-        <w:br/>
-      </w:r>
-      <w:r>
-        <w:rPr>
-          <w:rStyle w:val="ExtensionTok"/>
-        </w:rPr>
-        <w:t xml:space="preserve">yarn</w:t>
-      </w:r>
-      <w:r>
-        <w:rPr>
-          <w:rStyle w:val="NormalTok"/>
-        </w:rPr>
-        <w:t xml:space="preserve"> build</w:t>
-      </w:r>
-      <w:r>
-        <w:br/>
-      </w:r>
-      <w:r>
-        <w:rPr>
-          <w:rStyle w:val="ExtensionTok"/>
-        </w:rPr>
-        <w:t xml:space="preserve">pm2</w:t>
-      </w:r>
-      <w:r>
-        <w:rPr>
-          <w:rStyle w:val="NormalTok"/>
-        </w:rPr>
-        <w:t xml:space="preserve"> restart health-logger</w:t>
-      </w:r>
-      <w:r>
-        <w:br/>
-      </w:r>
-      <w:r>
-        <w:br/>
-      </w:r>
-      <w:r>
-        <w:rPr>
-          <w:rStyle w:val="CommentTok"/>
-        </w:rPr>
-        <w:t xml:space="preserve"># Database backup (set up as a daily cron)</w:t>
-      </w:r>
-      <w:r>
-        <w:br/>
-      </w:r>
-      <w:r>
-        <w:rPr>
-          <w:rStyle w:val="ExtensionTok"/>
-        </w:rPr>
-        <w:t xml:space="preserve">pg_dump</w:t>
-      </w:r>
-      <w:r>
-        <w:rPr>
-          <w:rStyle w:val="NormalTok"/>
-        </w:rPr>
-        <w:t xml:space="preserve"> </w:t>
-      </w:r>
-      <w:r>
-        <w:rPr>
-          <w:rStyle w:val="AttributeTok"/>
-        </w:rPr>
-        <w:t xml:space="preserve">-U</w:t>
-      </w:r>
-      <w:r>
-        <w:rPr>
-          <w:rStyle w:val="NormalTok"/>
-        </w:rPr>
-        <w:t xml:space="preserve"> healthlogger healthlogger </w:t>
-      </w:r>
-      <w:r>
-        <w:rPr>
-          <w:rStyle w:val="OperatorTok"/>
-        </w:rPr>
-        <w:t xml:space="preserve">&gt;</w:t>
-      </w:r>
-      <w:r>
-        <w:rPr>
-          <w:rStyle w:val="NormalTok"/>
-        </w:rPr>
-        <w:t xml:space="preserve"> /backups/healthlogger_</w:t>
-      </w:r>
-      <w:r>
-        <w:rPr>
-          <w:rStyle w:val="VariableTok"/>
-        </w:rPr>
-        <w:t xml:space="preserve">$(</w:t>
-      </w:r>
-      <w:r>
-        <w:rPr>
-          <w:rStyle w:val="FunctionTok"/>
-        </w:rPr>
-        <w:t xml:space="preserve">date</w:t>
-      </w:r>
-      <w:r>
-        <w:rPr>
-          <w:rStyle w:val="NormalTok"/>
-        </w:rPr>
-        <w:t xml:space="preserve"> +%Y%m%d</w:t>
-      </w:r>
-      <w:r>
-        <w:rPr>
-          <w:rStyle w:val="VariableTok"/>
-        </w:rPr>
-        <w:t xml:space="preserve">)</w:t>
-      </w:r>
-      <w:r>
-        <w:rPr>
-          <w:rStyle w:val="NormalTok"/>
-        </w:rPr>
-        <w:t xml:space="preserve">.sql</w:t>
-      </w:r>
-    </w:p>
-    <w:p>
-      <w:pPr>
-        <w:pStyle w:val="FirstParagraph"/>
-      </w:pPr>
-      <w:r>
-        <w:t xml:space="preserve">That’s it! 🎉</w:t>
-      </w:r>
-    </w:p>
-    <w:bookmarkEnd w:id="39"/>
-    <w:bookmarkEnd w:id="40"/>
     <w:sectPr/>
   </w:body>
 </w:document>

</xml_diff>

<commit_message>
Replace Abacus email API with Nodemailer SMTP
</commit_message>
<xml_diff>
--- a/SELF_HOSTING_GUIDE.docx
+++ b/SELF_HOSTING_GUIDE.docx
@@ -1543,13 +1543,13 @@
     </w:p>
     <w:bookmarkEnd w:id="25"/>
     <w:bookmarkEnd w:id="26"/>
-    <w:bookmarkStart w:id="30" w:name="email-what-needs-to-change"/>
+    <w:bookmarkStart w:id="30" w:name="email-already-configured-with-nodemailer"/>
     <w:p>
       <w:pPr>
         <w:pStyle w:val="Heading2"/>
       </w:pPr>
       <w:r>
-        <w:t xml:space="preserve">6. Email — What Needs to Change</w:t>
+        <w:t xml:space="preserve">6. Email — Already Configured with Nodemailer</w:t>
       </w:r>
     </w:p>
     <w:p>
@@ -1557,832 +1557,212 @@
         <w:pStyle w:val="FirstParagraph"/>
       </w:pPr>
       <w:r>
-        <w:t xml:space="preserve">The app currently uses the Abacus AI notification API for emails. You need to replace it with a standard SMTP approach (Nodemailer).</w:t>
-      </w:r>
-    </w:p>
-    <w:bookmarkStart w:id="27" w:name="install-nodemailer"/>
-    <w:p>
-      <w:pPr>
-        <w:pStyle w:val="Heading3"/>
-      </w:pPr>
-      <w:r>
-        <w:t xml:space="preserve">Install Nodemailer:</w:t>
-      </w:r>
-    </w:p>
-    <w:p>
-      <w:pPr>
-        <w:pStyle w:val="SourceCode"/>
-      </w:pPr>
-      <w:r>
-        <w:rPr>
-          <w:rStyle w:val="ExtensionTok"/>
-        </w:rPr>
-        <w:t xml:space="preserve">yarn</w:t>
-      </w:r>
-      <w:r>
-        <w:rPr>
-          <w:rStyle w:val="NormalTok"/>
-        </w:rPr>
-        <w:t xml:space="preserve"> add nodemailer</w:t>
-      </w:r>
-      <w:r>
-        <w:br/>
-      </w:r>
-      <w:r>
-        <w:rPr>
-          <w:rStyle w:val="ExtensionTok"/>
-        </w:rPr>
-        <w:t xml:space="preserve">yarn</w:t>
-      </w:r>
-      <w:r>
-        <w:rPr>
-          <w:rStyle w:val="NormalTok"/>
-        </w:rPr>
-        <w:t xml:space="preserve"> add </w:t>
-      </w:r>
-      <w:r>
-        <w:rPr>
-          <w:rStyle w:val="AttributeTok"/>
-        </w:rPr>
-        <w:t xml:space="preserve">-D</w:t>
-      </w:r>
-      <w:r>
-        <w:rPr>
-          <w:rStyle w:val="NormalTok"/>
-        </w:rPr>
-        <w:t xml:space="preserve"> @types/nodemailer</w:t>
-      </w:r>
-    </w:p>
-    <w:bookmarkEnd w:id="27"/>
-    <w:bookmarkStart w:id="29" w:name="replace-appapiemail-summaryroute.ts"/>
-    <w:p>
-      <w:pPr>
-        <w:pStyle w:val="Heading3"/>
-      </w:pPr>
-      <w:r>
-        <w:t xml:space="preserve">Replace</w:t>
-      </w:r>
-      <w:r>
-        <w:t xml:space="preserve"> </w:t>
-      </w:r>
-      <w:r>
-        <w:rPr>
-          <w:rStyle w:val="VerbatimChar"/>
-        </w:rPr>
-        <w:t xml:space="preserve">app/api/email-summary/route.ts</w:t>
-      </w:r>
-    </w:p>
-    <w:p>
-      <w:pPr>
-        <w:pStyle w:val="FirstParagraph"/>
-      </w:pPr>
-      <w:r>
-        <w:t xml:space="preserve">Find the section near line 222 that calls</w:t>
-      </w:r>
-      <w:r>
-        <w:t xml:space="preserve"> </w:t>
-      </w:r>
-      <w:r>
-        <w:rPr>
-          <w:rStyle w:val="VerbatimChar"/>
-        </w:rPr>
-        <w:t xml:space="preserve">https://apps.abacus.ai/api/sendNotificationEmail</w:t>
-      </w:r>
-      <w:r>
-        <w:t xml:space="preserve"> </w:t>
-      </w:r>
-      <w:r>
-        <w:t xml:space="preserve">and replace it with:</w:t>
-      </w:r>
-    </w:p>
-    <w:p>
-      <w:pPr>
-        <w:pStyle w:val="SourceCode"/>
-      </w:pPr>
-      <w:r>
-        <w:rPr>
-          <w:rStyle w:val="ImportTok"/>
-        </w:rPr>
-        <w:t xml:space="preserve">import</w:t>
-      </w:r>
-      <w:r>
-        <w:rPr>
-          <w:rStyle w:val="NormalTok"/>
-        </w:rPr>
-        <w:t xml:space="preserve"> nodemailer </w:t>
-      </w:r>
-      <w:r>
-        <w:rPr>
-          <w:rStyle w:val="ImportTok"/>
-        </w:rPr>
-        <w:t xml:space="preserve">from</w:t>
-      </w:r>
-      <w:r>
-        <w:rPr>
-          <w:rStyle w:val="NormalTok"/>
-        </w:rPr>
-        <w:t xml:space="preserve"> </w:t>
-      </w:r>
-      <w:r>
-        <w:rPr>
-          <w:rStyle w:val="StringTok"/>
-        </w:rPr>
-        <w:t xml:space="preserve">'nodemailer'</w:t>
-      </w:r>
-      <w:r>
-        <w:rPr>
-          <w:rStyle w:val="OperatorTok"/>
-        </w:rPr>
-        <w:t xml:space="preserve">;</w:t>
-      </w:r>
-      <w:r>
-        <w:br/>
-      </w:r>
-      <w:r>
-        <w:br/>
-      </w:r>
-      <w:r>
-        <w:rPr>
-          <w:rStyle w:val="CommentTok"/>
-        </w:rPr>
-        <w:t xml:space="preserve">// ... (keep all the existing HTML body building code) ...</w:t>
-      </w:r>
-      <w:r>
-        <w:br/>
-      </w:r>
-      <w:r>
-        <w:br/>
-      </w:r>
-      <w:r>
-        <w:rPr>
-          <w:rStyle w:val="CommentTok"/>
-        </w:rPr>
-        <w:t xml:space="preserve">// Replace the Abacus email fetch with:</w:t>
-      </w:r>
-      <w:r>
-        <w:br/>
-      </w:r>
-      <w:r>
-        <w:rPr>
-          <w:rStyle w:val="KeywordTok"/>
-        </w:rPr>
-        <w:t xml:space="preserve">const</w:t>
-      </w:r>
-      <w:r>
-        <w:rPr>
-          <w:rStyle w:val="NormalTok"/>
-        </w:rPr>
-        <w:t xml:space="preserve"> transporter </w:t>
-      </w:r>
-      <w:r>
-        <w:rPr>
-          <w:rStyle w:val="OperatorTok"/>
-        </w:rPr>
-        <w:t xml:space="preserve">=</w:t>
-      </w:r>
-      <w:r>
-        <w:rPr>
-          <w:rStyle w:val="NormalTok"/>
-        </w:rPr>
-        <w:t xml:space="preserve"> nodemailer</w:t>
-      </w:r>
-      <w:r>
-        <w:rPr>
-          <w:rStyle w:val="OperatorTok"/>
-        </w:rPr>
-        <w:t xml:space="preserve">.</w:t>
-      </w:r>
-      <w:r>
-        <w:rPr>
-          <w:rStyle w:val="FunctionTok"/>
-        </w:rPr>
-        <w:t xml:space="preserve">createTransport</w:t>
-      </w:r>
-      <w:r>
-        <w:rPr>
-          <w:rStyle w:val="NormalTok"/>
-        </w:rPr>
-        <w:t xml:space="preserve">({</w:t>
-      </w:r>
-      <w:r>
-        <w:br/>
-      </w:r>
-      <w:r>
-        <w:rPr>
-          <w:rStyle w:val="NormalTok"/>
-        </w:rPr>
-        <w:t xml:space="preserve">  host</w:t>
-      </w:r>
-      <w:r>
-        <w:rPr>
-          <w:rStyle w:val="OperatorTok"/>
-        </w:rPr>
-        <w:t xml:space="preserve">:</w:t>
-      </w:r>
-      <w:r>
-        <w:rPr>
-          <w:rStyle w:val="NormalTok"/>
-        </w:rPr>
-        <w:t xml:space="preserve"> </w:t>
-      </w:r>
-      <w:r>
-        <w:rPr>
-          <w:rStyle w:val="BuiltInTok"/>
-        </w:rPr>
-        <w:t xml:space="preserve">process</w:t>
-      </w:r>
-      <w:r>
-        <w:rPr>
-          <w:rStyle w:val="OperatorTok"/>
-        </w:rPr>
-        <w:t xml:space="preserve">.</w:t>
-      </w:r>
-      <w:r>
-        <w:rPr>
-          <w:rStyle w:val="AttributeTok"/>
-        </w:rPr>
-        <w:t xml:space="preserve">env</w:t>
-      </w:r>
-      <w:r>
-        <w:rPr>
-          <w:rStyle w:val="OperatorTok"/>
-        </w:rPr>
-        <w:t xml:space="preserve">.</w:t>
-      </w:r>
-      <w:r>
-        <w:rPr>
-          <w:rStyle w:val="AttributeTok"/>
-        </w:rPr>
-        <w:t xml:space="preserve">SMTP_HOST</w:t>
-      </w:r>
-      <w:r>
-        <w:rPr>
-          <w:rStyle w:val="OperatorTok"/>
-        </w:rPr>
-        <w:t xml:space="preserve">,</w:t>
-      </w:r>
-      <w:r>
-        <w:br/>
-      </w:r>
-      <w:r>
-        <w:rPr>
-          <w:rStyle w:val="NormalTok"/>
-        </w:rPr>
-        <w:t xml:space="preserve">  port</w:t>
-      </w:r>
-      <w:r>
-        <w:rPr>
-          <w:rStyle w:val="OperatorTok"/>
-        </w:rPr>
-        <w:t xml:space="preserve">:</w:t>
-      </w:r>
-      <w:r>
-        <w:rPr>
-          <w:rStyle w:val="NormalTok"/>
-        </w:rPr>
-        <w:t xml:space="preserve"> </w:t>
-      </w:r>
-      <w:r>
-        <w:rPr>
-          <w:rStyle w:val="PreprocessorTok"/>
-        </w:rPr>
-        <w:t xml:space="preserve">parseInt</w:t>
-      </w:r>
-      <w:r>
-        <w:rPr>
-          <w:rStyle w:val="NormalTok"/>
-        </w:rPr>
-        <w:t xml:space="preserve">(</w:t>
-      </w:r>
-      <w:r>
-        <w:rPr>
-          <w:rStyle w:val="BuiltInTok"/>
-        </w:rPr>
-        <w:t xml:space="preserve">process</w:t>
-      </w:r>
-      <w:r>
-        <w:rPr>
-          <w:rStyle w:val="OperatorTok"/>
-        </w:rPr>
-        <w:t xml:space="preserve">.</w:t>
-      </w:r>
-      <w:r>
-        <w:rPr>
-          <w:rStyle w:val="AttributeTok"/>
-        </w:rPr>
-        <w:t xml:space="preserve">env</w:t>
-      </w:r>
-      <w:r>
-        <w:rPr>
-          <w:rStyle w:val="OperatorTok"/>
-        </w:rPr>
-        <w:t xml:space="preserve">.</w:t>
-      </w:r>
-      <w:r>
-        <w:rPr>
-          <w:rStyle w:val="AttributeTok"/>
-        </w:rPr>
-        <w:t xml:space="preserve">SMTP_PORT</w:t>
-      </w:r>
-      <w:r>
-        <w:rPr>
-          <w:rStyle w:val="NormalTok"/>
-        </w:rPr>
-        <w:t xml:space="preserve"> </w:t>
-      </w:r>
-      <w:r>
-        <w:rPr>
-          <w:rStyle w:val="OperatorTok"/>
-        </w:rPr>
-        <w:t xml:space="preserve">||</w:t>
-      </w:r>
-      <w:r>
-        <w:rPr>
-          <w:rStyle w:val="NormalTok"/>
-        </w:rPr>
-        <w:t xml:space="preserve"> </w:t>
-      </w:r>
-      <w:r>
-        <w:rPr>
-          <w:rStyle w:val="StringTok"/>
-        </w:rPr>
-        <w:t xml:space="preserve">'587'</w:t>
-      </w:r>
-      <w:r>
-        <w:rPr>
-          <w:rStyle w:val="NormalTok"/>
-        </w:rPr>
-        <w:t xml:space="preserve">)</w:t>
-      </w:r>
-      <w:r>
-        <w:rPr>
-          <w:rStyle w:val="OperatorTok"/>
-        </w:rPr>
-        <w:t xml:space="preserve">,</w:t>
-      </w:r>
-      <w:r>
-        <w:br/>
-      </w:r>
-      <w:r>
-        <w:rPr>
-          <w:rStyle w:val="NormalTok"/>
-        </w:rPr>
-        <w:t xml:space="preserve">  secure</w:t>
-      </w:r>
-      <w:r>
-        <w:rPr>
-          <w:rStyle w:val="OperatorTok"/>
-        </w:rPr>
-        <w:t xml:space="preserve">:</w:t>
-      </w:r>
-      <w:r>
-        <w:rPr>
-          <w:rStyle w:val="NormalTok"/>
-        </w:rPr>
-        <w:t xml:space="preserve"> </w:t>
-      </w:r>
-      <w:r>
-        <w:rPr>
-          <w:rStyle w:val="KeywordTok"/>
-        </w:rPr>
-        <w:t xml:space="preserve">false</w:t>
-      </w:r>
-      <w:r>
-        <w:rPr>
-          <w:rStyle w:val="OperatorTok"/>
-        </w:rPr>
-        <w:t xml:space="preserve">,</w:t>
-      </w:r>
-      <w:r>
-        <w:br/>
-      </w:r>
-      <w:r>
-        <w:rPr>
-          <w:rStyle w:val="NormalTok"/>
-        </w:rPr>
-        <w:t xml:space="preserve">  auth</w:t>
-      </w:r>
-      <w:r>
-        <w:rPr>
-          <w:rStyle w:val="OperatorTok"/>
-        </w:rPr>
-        <w:t xml:space="preserve">:</w:t>
-      </w:r>
-      <w:r>
-        <w:rPr>
-          <w:rStyle w:val="NormalTok"/>
-        </w:rPr>
-        <w:t xml:space="preserve"> {</w:t>
-      </w:r>
-      <w:r>
-        <w:br/>
-      </w:r>
-      <w:r>
-        <w:rPr>
-          <w:rStyle w:val="NormalTok"/>
-        </w:rPr>
-        <w:t xml:space="preserve">    user</w:t>
-      </w:r>
-      <w:r>
-        <w:rPr>
-          <w:rStyle w:val="OperatorTok"/>
-        </w:rPr>
-        <w:t xml:space="preserve">:</w:t>
-      </w:r>
-      <w:r>
-        <w:rPr>
-          <w:rStyle w:val="NormalTok"/>
-        </w:rPr>
-        <w:t xml:space="preserve"> </w:t>
-      </w:r>
-      <w:r>
-        <w:rPr>
-          <w:rStyle w:val="BuiltInTok"/>
-        </w:rPr>
-        <w:t xml:space="preserve">process</w:t>
-      </w:r>
-      <w:r>
-        <w:rPr>
-          <w:rStyle w:val="OperatorTok"/>
-        </w:rPr>
-        <w:t xml:space="preserve">.</w:t>
-      </w:r>
-      <w:r>
-        <w:rPr>
-          <w:rStyle w:val="AttributeTok"/>
-        </w:rPr>
-        <w:t xml:space="preserve">env</w:t>
-      </w:r>
-      <w:r>
-        <w:rPr>
-          <w:rStyle w:val="OperatorTok"/>
-        </w:rPr>
-        <w:t xml:space="preserve">.</w:t>
-      </w:r>
-      <w:r>
-        <w:rPr>
-          <w:rStyle w:val="AttributeTok"/>
-        </w:rPr>
-        <w:t xml:space="preserve">SMTP_USER</w:t>
-      </w:r>
-      <w:r>
-        <w:rPr>
-          <w:rStyle w:val="OperatorTok"/>
-        </w:rPr>
-        <w:t xml:space="preserve">,</w:t>
-      </w:r>
-      <w:r>
-        <w:br/>
-      </w:r>
-      <w:r>
-        <w:rPr>
-          <w:rStyle w:val="NormalTok"/>
-        </w:rPr>
-        <w:t xml:space="preserve">    pass</w:t>
-      </w:r>
-      <w:r>
-        <w:rPr>
-          <w:rStyle w:val="OperatorTok"/>
-        </w:rPr>
-        <w:t xml:space="preserve">:</w:t>
-      </w:r>
-      <w:r>
-        <w:rPr>
-          <w:rStyle w:val="NormalTok"/>
-        </w:rPr>
-        <w:t xml:space="preserve"> </w:t>
-      </w:r>
-      <w:r>
-        <w:rPr>
-          <w:rStyle w:val="BuiltInTok"/>
-        </w:rPr>
-        <w:t xml:space="preserve">process</w:t>
-      </w:r>
-      <w:r>
-        <w:rPr>
-          <w:rStyle w:val="OperatorTok"/>
-        </w:rPr>
-        <w:t xml:space="preserve">.</w:t>
-      </w:r>
-      <w:r>
-        <w:rPr>
-          <w:rStyle w:val="AttributeTok"/>
-        </w:rPr>
-        <w:t xml:space="preserve">env</w:t>
-      </w:r>
-      <w:r>
-        <w:rPr>
-          <w:rStyle w:val="OperatorTok"/>
-        </w:rPr>
-        <w:t xml:space="preserve">.</w:t>
-      </w:r>
-      <w:r>
-        <w:rPr>
-          <w:rStyle w:val="AttributeTok"/>
-        </w:rPr>
-        <w:t xml:space="preserve">SMTP_PASS</w:t>
-      </w:r>
-      <w:r>
-        <w:rPr>
-          <w:rStyle w:val="OperatorTok"/>
-        </w:rPr>
-        <w:t xml:space="preserve">,</w:t>
-      </w:r>
-      <w:r>
-        <w:br/>
-      </w:r>
-      <w:r>
-        <w:rPr>
-          <w:rStyle w:val="NormalTok"/>
-        </w:rPr>
-        <w:t xml:space="preserve">  }</w:t>
-      </w:r>
-      <w:r>
-        <w:rPr>
-          <w:rStyle w:val="OperatorTok"/>
-        </w:rPr>
-        <w:t xml:space="preserve">,</w:t>
-      </w:r>
-      <w:r>
-        <w:br/>
-      </w:r>
-      <w:r>
-        <w:rPr>
-          <w:rStyle w:val="NormalTok"/>
-        </w:rPr>
-        <w:t xml:space="preserve">})</w:t>
-      </w:r>
-      <w:r>
-        <w:rPr>
-          <w:rStyle w:val="OperatorTok"/>
-        </w:rPr>
-        <w:t xml:space="preserve">;</w:t>
-      </w:r>
-      <w:r>
-        <w:br/>
-      </w:r>
-      <w:r>
-        <w:br/>
-      </w:r>
-      <w:r>
-        <w:rPr>
-          <w:rStyle w:val="ControlFlowTok"/>
-        </w:rPr>
-        <w:t xml:space="preserve">await</w:t>
-      </w:r>
-      <w:r>
-        <w:rPr>
-          <w:rStyle w:val="NormalTok"/>
-        </w:rPr>
-        <w:t xml:space="preserve"> transporter</w:t>
-      </w:r>
-      <w:r>
-        <w:rPr>
-          <w:rStyle w:val="OperatorTok"/>
-        </w:rPr>
-        <w:t xml:space="preserve">.</w:t>
-      </w:r>
-      <w:r>
-        <w:rPr>
-          <w:rStyle w:val="FunctionTok"/>
-        </w:rPr>
-        <w:t xml:space="preserve">sendMail</w:t>
-      </w:r>
-      <w:r>
-        <w:rPr>
-          <w:rStyle w:val="NormalTok"/>
-        </w:rPr>
-        <w:t xml:space="preserve">({</w:t>
-      </w:r>
-      <w:r>
-        <w:br/>
-      </w:r>
-      <w:r>
-        <w:rPr>
-          <w:rStyle w:val="NormalTok"/>
-        </w:rPr>
-        <w:t xml:space="preserve">  from</w:t>
-      </w:r>
-      <w:r>
-        <w:rPr>
-          <w:rStyle w:val="OperatorTok"/>
-        </w:rPr>
-        <w:t xml:space="preserve">:</w:t>
-      </w:r>
-      <w:r>
-        <w:rPr>
-          <w:rStyle w:val="NormalTok"/>
-        </w:rPr>
-        <w:t xml:space="preserve"> </w:t>
-      </w:r>
-      <w:r>
-        <w:rPr>
-          <w:rStyle w:val="BuiltInTok"/>
-        </w:rPr>
-        <w:t xml:space="preserve">process</w:t>
-      </w:r>
-      <w:r>
-        <w:rPr>
-          <w:rStyle w:val="OperatorTok"/>
-        </w:rPr>
-        <w:t xml:space="preserve">.</w:t>
-      </w:r>
-      <w:r>
-        <w:rPr>
-          <w:rStyle w:val="AttributeTok"/>
-        </w:rPr>
-        <w:t xml:space="preserve">env</w:t>
-      </w:r>
-      <w:r>
-        <w:rPr>
-          <w:rStyle w:val="OperatorTok"/>
-        </w:rPr>
-        <w:t xml:space="preserve">.</w:t>
-      </w:r>
-      <w:r>
-        <w:rPr>
-          <w:rStyle w:val="AttributeTok"/>
-        </w:rPr>
-        <w:t xml:space="preserve">EMAIL_FROM</w:t>
-      </w:r>
-      <w:r>
-        <w:rPr>
-          <w:rStyle w:val="OperatorTok"/>
-        </w:rPr>
-        <w:t xml:space="preserve">,</w:t>
-      </w:r>
-      <w:r>
-        <w:br/>
-      </w:r>
-      <w:r>
-        <w:rPr>
-          <w:rStyle w:val="NormalTok"/>
-        </w:rPr>
-        <w:t xml:space="preserve">  to</w:t>
-      </w:r>
-      <w:r>
-        <w:rPr>
-          <w:rStyle w:val="OperatorTok"/>
-        </w:rPr>
-        <w:t xml:space="preserve">:</w:t>
-      </w:r>
-      <w:r>
-        <w:rPr>
-          <w:rStyle w:val="NormalTok"/>
-        </w:rPr>
-        <w:t xml:space="preserve"> recipientEmail</w:t>
-      </w:r>
-      <w:r>
-        <w:rPr>
-          <w:rStyle w:val="OperatorTok"/>
-        </w:rPr>
-        <w:t xml:space="preserve">,</w:t>
-      </w:r>
-      <w:r>
-        <w:br/>
-      </w:r>
-      <w:r>
-        <w:rPr>
-          <w:rStyle w:val="NormalTok"/>
-        </w:rPr>
-        <w:t xml:space="preserve">  subject</w:t>
-      </w:r>
-      <w:r>
-        <w:rPr>
-          <w:rStyle w:val="OperatorTok"/>
-        </w:rPr>
-        <w:t xml:space="preserve">:</w:t>
-      </w:r>
-      <w:r>
-        <w:rPr>
-          <w:rStyle w:val="NormalTok"/>
-        </w:rPr>
-        <w:t xml:space="preserve"> </w:t>
-      </w:r>
-      <w:r>
-        <w:rPr>
-          <w:rStyle w:val="VerbatimStringTok"/>
-        </w:rPr>
-        <w:t xml:space="preserve">`Health Summary — </w:t>
-      </w:r>
-      <w:r>
-        <w:rPr>
-          <w:rStyle w:val="SpecialCharTok"/>
-        </w:rPr>
-        <w:t xml:space="preserve">${</w:t>
-      </w:r>
-      <w:r>
-        <w:rPr>
-          <w:rStyle w:val="NormalTok"/>
-        </w:rPr>
-        <w:t xml:space="preserve">periodLabel</w:t>
-      </w:r>
-      <w:r>
-        <w:rPr>
-          <w:rStyle w:val="SpecialCharTok"/>
-        </w:rPr>
-        <w:t xml:space="preserve">}</w:t>
-      </w:r>
-      <w:r>
-        <w:rPr>
-          <w:rStyle w:val="VerbatimStringTok"/>
-        </w:rPr>
-        <w:t xml:space="preserve">`</w:t>
-      </w:r>
-      <w:r>
-        <w:rPr>
-          <w:rStyle w:val="OperatorTok"/>
-        </w:rPr>
-        <w:t xml:space="preserve">,</w:t>
-      </w:r>
-      <w:r>
-        <w:br/>
-      </w:r>
-      <w:r>
-        <w:rPr>
-          <w:rStyle w:val="NormalTok"/>
-        </w:rPr>
-        <w:t xml:space="preserve">  html</w:t>
-      </w:r>
-      <w:r>
-        <w:rPr>
-          <w:rStyle w:val="OperatorTok"/>
-        </w:rPr>
-        <w:t xml:space="preserve">:</w:t>
-      </w:r>
-      <w:r>
-        <w:rPr>
-          <w:rStyle w:val="NormalTok"/>
-        </w:rPr>
-        <w:t xml:space="preserve"> htmlBody</w:t>
-      </w:r>
-      <w:r>
-        <w:rPr>
-          <w:rStyle w:val="OperatorTok"/>
-        </w:rPr>
-        <w:t xml:space="preserve">,</w:t>
-      </w:r>
-      <w:r>
-        <w:rPr>
-          <w:rStyle w:val="NormalTok"/>
-        </w:rPr>
-        <w:t xml:space="preserve">  </w:t>
-      </w:r>
-      <w:r>
-        <w:rPr>
-          <w:rStyle w:val="CommentTok"/>
-        </w:rPr>
-        <w:t xml:space="preserve">// the HTML string you already build</w:t>
-      </w:r>
-      <w:r>
-        <w:br/>
-      </w:r>
-      <w:r>
-        <w:rPr>
-          <w:rStyle w:val="NormalTok"/>
-        </w:rPr>
-        <w:t xml:space="preserve">})</w:t>
-      </w:r>
-      <w:r>
-        <w:rPr>
-          <w:rStyle w:val="OperatorTok"/>
-        </w:rPr>
-        <w:t xml:space="preserve">;</w:t>
-      </w:r>
-    </w:p>
-    <w:p>
-      <w:pPr>
-        <w:pStyle w:val="FirstParagraph"/>
-      </w:pPr>
+        <w:t xml:space="preserve">The app already uses</w:t>
+      </w:r>
+      <w:r>
+        <w:t xml:space="preserve"> </w:t>
+      </w:r>
       <w:r>
         <w:rPr>
           <w:bCs/>
           <w:b/>
         </w:rPr>
-        <w:t xml:space="preserve">Gmail tip:</w:t>
-      </w:r>
-      <w:r>
-        <w:t xml:space="preserve"> </w:t>
-      </w:r>
-      <w:r>
-        <w:t xml:space="preserve">Use an</w:t>
-      </w:r>
-      <w:r>
-        <w:t xml:space="preserve"> </w:t>
-      </w:r>
-      <w:hyperlink r:id="rId28">
+        <w:t xml:space="preserve">Nodemailer</w:t>
+      </w:r>
+      <w:r>
+        <w:t xml:space="preserve"> </w:t>
+      </w:r>
+      <w:r>
+        <w:t xml:space="preserve">for sending health summary emails via SMTP. No code changes needed — just set these env vars:</w:t>
+      </w:r>
+    </w:p>
+    <w:p>
+      <w:pPr>
+        <w:pStyle w:val="SourceCode"/>
+      </w:pPr>
+      <w:r>
+        <w:rPr>
+          <w:rStyle w:val="VerbatimChar"/>
+        </w:rPr>
+        <w:t xml:space="preserve">SMTP_HOST="smtp.gmail.com"        # or your Hostinger mail server</w:t>
+      </w:r>
+      <w:r>
+        <w:br/>
+      </w:r>
+      <w:r>
+        <w:rPr>
+          <w:rStyle w:val="VerbatimChar"/>
+        </w:rPr>
+        <w:t xml:space="preserve">SMTP_PORT="587"                    # 587 for STARTTLS, 465 for SSL</w:t>
+      </w:r>
+      <w:r>
+        <w:br/>
+      </w:r>
+      <w:r>
+        <w:rPr>
+          <w:rStyle w:val="VerbatimChar"/>
+        </w:rPr>
+        <w:t xml:space="preserve">SMTP_USER="your-email@gmail.com"</w:t>
+      </w:r>
+      <w:r>
+        <w:br/>
+      </w:r>
+      <w:r>
+        <w:rPr>
+          <w:rStyle w:val="VerbatimChar"/>
+        </w:rPr>
+        <w:t xml:space="preserve">SMTP_PASS="your-app-password"</w:t>
+      </w:r>
+      <w:r>
+        <w:br/>
+      </w:r>
+      <w:r>
+        <w:rPr>
+          <w:rStyle w:val="VerbatimChar"/>
+        </w:rPr>
+        <w:t xml:space="preserve">EMAIL_FROM="Health Logger &lt;your-email@gmail.com&gt;"</w:t>
+      </w:r>
+    </w:p>
+    <w:bookmarkStart w:id="28" w:name="gmail-setup"/>
+    <w:p>
+      <w:pPr>
+        <w:pStyle w:val="Heading3"/>
+      </w:pPr>
+      <w:r>
+        <w:t xml:space="preserve">Gmail Setup</w:t>
+      </w:r>
+    </w:p>
+    <w:p>
+      <w:pPr>
+        <w:numPr>
+          <w:ilvl w:val="0"/>
+          <w:numId w:val="1002"/>
+        </w:numPr>
+        <w:pStyle w:val="Compact"/>
+      </w:pPr>
+      <w:r>
+        <w:t xml:space="preserve">Enable 2-Factor Authentication on your Google Account</w:t>
+      </w:r>
+    </w:p>
+    <w:p>
+      <w:pPr>
+        <w:numPr>
+          <w:ilvl w:val="0"/>
+          <w:numId w:val="1002"/>
+        </w:numPr>
+        <w:pStyle w:val="Compact"/>
+      </w:pPr>
+      <w:r>
+        <w:t xml:space="preserve">Go to</w:t>
+      </w:r>
+      <w:r>
+        <w:t xml:space="preserve"> </w:t>
+      </w:r>
+      <w:hyperlink r:id="rId27">
         <w:r>
           <w:rPr>
             <w:rStyle w:val="Hyperlink"/>
           </w:rPr>
-          <w:t xml:space="preserve">App Password</w:t>
+          <w:t xml:space="preserve">App Passwords</w:t>
         </w:r>
       </w:hyperlink>
-      <w:r>
-        <w:t xml:space="preserve"> </w:t>
-      </w:r>
-      <w:r>
-        <w:t xml:space="preserve">— not your regular Gmail password.</w:t>
+    </w:p>
+    <w:p>
+      <w:pPr>
+        <w:numPr>
+          <w:ilvl w:val="0"/>
+          <w:numId w:val="1002"/>
+        </w:numPr>
+        <w:pStyle w:val="Compact"/>
+      </w:pPr>
+      <w:r>
+        <w:t xml:space="preserve">Create a new app password → use it as</w:t>
+      </w:r>
+      <w:r>
+        <w:t xml:space="preserve"> </w:t>
+      </w:r>
+      <w:r>
+        <w:rPr>
+          <w:rStyle w:val="VerbatimChar"/>
+        </w:rPr>
+        <w:t xml:space="preserve">SMTP_PASS</w:t>
+      </w:r>
+    </w:p>
+    <w:bookmarkEnd w:id="28"/>
+    <w:bookmarkStart w:id="29" w:name="hostinger-email-setup"/>
+    <w:p>
+      <w:pPr>
+        <w:pStyle w:val="Heading3"/>
+      </w:pPr>
+      <w:r>
+        <w:t xml:space="preserve">Hostinger Email Setup</w:t>
+      </w:r>
+    </w:p>
+    <w:p>
+      <w:pPr>
+        <w:pStyle w:val="FirstParagraph"/>
+      </w:pPr>
+      <w:r>
+        <w:t xml:space="preserve">If you set up an email account through your Hostinger domain (e.g.,</w:t>
+      </w:r>
+      <w:r>
+        <w:t xml:space="preserve"> </w:t>
+      </w:r>
+      <w:r>
+        <w:rPr>
+          <w:rStyle w:val="VerbatimChar"/>
+        </w:rPr>
+        <w:t xml:space="preserve">health@yourdomain.com</w:t>
+      </w:r>
+      <w:r>
+        <w:t xml:space="preserve">):</w:t>
+      </w:r>
+    </w:p>
+    <w:p>
+      <w:pPr>
+        <w:pStyle w:val="SourceCode"/>
+      </w:pPr>
+      <w:r>
+        <w:rPr>
+          <w:rStyle w:val="VerbatimChar"/>
+        </w:rPr>
+        <w:t xml:space="preserve">SMTP_HOST="smtp.hostinger.com"</w:t>
+      </w:r>
+      <w:r>
+        <w:br/>
+      </w:r>
+      <w:r>
+        <w:rPr>
+          <w:rStyle w:val="VerbatimChar"/>
+        </w:rPr>
+        <w:t xml:space="preserve">SMTP_PORT="465"</w:t>
+      </w:r>
+      <w:r>
+        <w:br/>
+      </w:r>
+      <w:r>
+        <w:rPr>
+          <w:rStyle w:val="VerbatimChar"/>
+        </w:rPr>
+        <w:t xml:space="preserve">SMTP_USER="health@yourdomain.com"</w:t>
+      </w:r>
+      <w:r>
+        <w:br/>
+      </w:r>
+      <w:r>
+        <w:rPr>
+          <w:rStyle w:val="VerbatimChar"/>
+        </w:rPr>
+        <w:t xml:space="preserve">SMTP_PASS="your-hostinger-email-password"</w:t>
+      </w:r>
+      <w:r>
+        <w:br/>
+      </w:r>
+      <w:r>
+        <w:rPr>
+          <w:rStyle w:val="VerbatimChar"/>
+        </w:rPr>
+        <w:t xml:space="preserve">EMAIL_FROM="Health Logger &lt;health@yourdomain.com&gt;"</w:t>
       </w:r>
     </w:p>
     <w:p>
@@ -3532,7 +2912,7 @@
               <w:jc w:val="left"/>
             </w:pPr>
             <w:r>
-              <w:t xml:space="preserve">Abacus notification API</w:t>
+              <w:t xml:space="preserve">Nodemailer + SMTP</w:t>
             </w:r>
           </w:p>
         </w:tc>
@@ -3544,7 +2924,7 @@
               <w:jc w:val="left"/>
             </w:pPr>
             <w:r>
-              <w:t xml:space="preserve">Nodemailer + SMTP (Gmail, etc.)</w:t>
+              <w:t xml:space="preserve">Already configured — just add SMTP env vars</w:t>
             </w:r>
           </w:p>
         </w:tc>
@@ -4306,11 +3686,126 @@
       </w:pPr>
     </w:lvl>
   </w:abstractNum>
+  <w:abstractNum w:abstractNumId="99411">
+    <w:nsid w:val="A99411"/>
+    <w:multiLevelType w:val="multilevel"/>
+    <w:lvl w:ilvl="0">
+      <w:start w:val="1"/>
+      <w:numFmt w:val="decimal"/>
+      <w:lvlText w:val="%1."/>
+      <w:lvlJc w:val="left"/>
+      <w:pPr>
+        <w:ind w:left="720" w:hanging="480"/>
+      </w:pPr>
+    </w:lvl>
+    <w:lvl w:ilvl="1">
+      <w:start w:val="1"/>
+      <w:numFmt w:val="decimal"/>
+      <w:lvlText w:val="%2."/>
+      <w:lvlJc w:val="left"/>
+      <w:pPr>
+        <w:ind w:left="1440" w:hanging="480"/>
+      </w:pPr>
+    </w:lvl>
+    <w:lvl w:ilvl="2">
+      <w:start w:val="1"/>
+      <w:numFmt w:val="decimal"/>
+      <w:lvlText w:val="%3."/>
+      <w:lvlJc w:val="left"/>
+      <w:pPr>
+        <w:ind w:left="2160" w:hanging="480"/>
+      </w:pPr>
+    </w:lvl>
+    <w:lvl w:ilvl="3">
+      <w:start w:val="1"/>
+      <w:numFmt w:val="decimal"/>
+      <w:lvlText w:val="%4."/>
+      <w:lvlJc w:val="left"/>
+      <w:pPr>
+        <w:ind w:left="2880" w:hanging="480"/>
+      </w:pPr>
+    </w:lvl>
+    <w:lvl w:ilvl="4">
+      <w:start w:val="1"/>
+      <w:numFmt w:val="decimal"/>
+      <w:lvlText w:val="%5."/>
+      <w:lvlJc w:val="left"/>
+      <w:pPr>
+        <w:ind w:left="3600" w:hanging="480"/>
+      </w:pPr>
+    </w:lvl>
+    <w:lvl w:ilvl="5">
+      <w:start w:val="1"/>
+      <w:numFmt w:val="decimal"/>
+      <w:lvlText w:val="%6."/>
+      <w:lvlJc w:val="left"/>
+      <w:pPr>
+        <w:ind w:left="4320" w:hanging="480"/>
+      </w:pPr>
+    </w:lvl>
+    <w:lvl w:ilvl="6">
+      <w:start w:val="1"/>
+      <w:numFmt w:val="decimal"/>
+      <w:lvlText w:val="%7."/>
+      <w:lvlJc w:val="left"/>
+      <w:pPr>
+        <w:ind w:left="5040" w:hanging="480"/>
+      </w:pPr>
+    </w:lvl>
+    <w:lvl w:ilvl="7">
+      <w:start w:val="1"/>
+      <w:numFmt w:val="decimal"/>
+      <w:lvlText w:val="%8."/>
+      <w:lvlJc w:val="left"/>
+      <w:pPr>
+        <w:ind w:left="5760" w:hanging="480"/>
+      </w:pPr>
+    </w:lvl>
+    <w:lvl w:ilvl="8">
+      <w:start w:val="1"/>
+      <w:numFmt w:val="decimal"/>
+      <w:lvlText w:val="%9."/>
+      <w:lvlJc w:val="left"/>
+      <w:pPr>
+        <w:ind w:left="6480" w:hanging="480"/>
+      </w:pPr>
+    </w:lvl>
+  </w:abstractNum>
   <w:num w:numId="1000">
     <w:abstractNumId w:val="990"/>
   </w:num>
   <w:num w:numId="1001">
     <w:abstractNumId w:val="991"/>
+  </w:num>
+  <w:num w:numId="1002">
+    <w:abstractNumId w:val="99411"/>
+    <w:lvlOverride w:ilvl="0">
+      <w:startOverride w:val="1"/>
+    </w:lvlOverride>
+    <w:lvlOverride w:ilvl="1">
+      <w:startOverride w:val="1"/>
+    </w:lvlOverride>
+    <w:lvlOverride w:ilvl="2">
+      <w:startOverride w:val="1"/>
+    </w:lvlOverride>
+    <w:lvlOverride w:ilvl="3">
+      <w:startOverride w:val="1"/>
+    </w:lvlOverride>
+    <w:lvlOverride w:ilvl="4">
+      <w:startOverride w:val="1"/>
+    </w:lvlOverride>
+    <w:lvlOverride w:ilvl="5">
+      <w:startOverride w:val="1"/>
+    </w:lvlOverride>
+    <w:lvlOverride w:ilvl="6">
+      <w:startOverride w:val="1"/>
+    </w:lvlOverride>
+    <w:lvlOverride w:ilvl="7">
+      <w:startOverride w:val="1"/>
+    </w:lvlOverride>
+    <w:lvlOverride w:ilvl="8">
+      <w:startOverride w:val="1"/>
+    </w:lvlOverride>
   </w:num>
 </w:numbering>
 </file>

</xml_diff>

<commit_message>
VPS-ready: remove appllm script, update self-hosting guide
</commit_message>
<xml_diff>
--- a/SELF_HOSTING_GUIDE.docx
+++ b/SELF_HOSTING_GUIDE.docx
@@ -1490,48 +1490,7 @@
         <w:pStyle w:val="FirstParagraph"/>
       </w:pPr>
       <w:r>
-        <w:t xml:space="preserve">Remove this line (it’s a platform-specific script, harmless but unnecessary):</w:t>
-      </w:r>
-    </w:p>
-    <w:p>
-      <w:pPr>
-        <w:pStyle w:val="SourceCode"/>
-      </w:pPr>
-      <w:r>
-        <w:rPr>
-          <w:rStyle w:val="KeywordTok"/>
-        </w:rPr>
-        <w:t xml:space="preserve">&lt;script</w:t>
-      </w:r>
-      <w:r>
-        <w:rPr>
-          <w:rStyle w:val="NormalTok"/>
-        </w:rPr>
-        <w:t xml:space="preserve"> </w:t>
-      </w:r>
-      <w:r>
-        <w:rPr>
-          <w:rStyle w:val="ErrorTok"/>
-        </w:rPr>
-        <w:t xml:space="preserve">src</w:t>
-      </w:r>
-      <w:r>
-        <w:rPr>
-          <w:rStyle w:val="OtherTok"/>
-        </w:rPr>
-        <w:t xml:space="preserve">=</w:t>
-      </w:r>
-      <w:r>
-        <w:rPr>
-          <w:rStyle w:val="StringTok"/>
-        </w:rPr>
-        <w:t xml:space="preserve">"https://apps.abacus.ai/chatllm/appllm-lib.js"</w:t>
-      </w:r>
-      <w:r>
-        <w:rPr>
-          <w:rStyle w:val="KeywordTok"/>
-        </w:rPr>
-        <w:t xml:space="preserve">&gt;&lt;/script&gt;</w:t>
+        <w:t xml:space="preserve">✅ Already done — the platform script tag has been removed.</w:t>
       </w:r>
     </w:p>
     <w:p>
@@ -2265,7 +2224,7 @@
         <w:pStyle w:val="FirstParagraph"/>
       </w:pPr>
       <w:r>
-        <w:t xml:space="preserve">Before running on your VPS, update</w:t>
+        <w:t xml:space="preserve">Before running on your VPS, edit</w:t>
       </w:r>
       <w:r>
         <w:t xml:space="preserve"> </w:t>
@@ -2277,15 +2236,70 @@
         <w:t xml:space="preserve">prisma/schema.prisma</w:t>
       </w:r>
       <w:r>
-        <w:t xml:space="preserve">:</w:t>
-      </w:r>
-    </w:p>
-    <w:p>
-      <w:pPr>
-        <w:pStyle w:val="BodyText"/>
-      </w:pPr>
-      <w:r>
-        <w:t xml:space="preserve">Change:</w:t>
+        <w:t xml:space="preserve"> </w:t>
+      </w:r>
+      <w:r>
+        <w:t xml:space="preserve">and</w:t>
+      </w:r>
+      <w:r>
+        <w:t xml:space="preserve"> </w:t>
+      </w:r>
+      <w:r>
+        <w:rPr>
+          <w:bCs/>
+          <w:b/>
+        </w:rPr>
+        <w:t xml:space="preserve">remove the</w:t>
+      </w:r>
+      <w:r>
+        <w:rPr>
+          <w:bCs/>
+          <w:b/>
+        </w:rPr>
+        <w:t xml:space="preserve"> </w:t>
+      </w:r>
+      <w:r>
+        <w:rPr>
+          <w:rStyle w:val="VerbatimChar"/>
+          <w:bCs/>
+          <w:b/>
+        </w:rPr>
+        <w:t xml:space="preserve">output</w:t>
+      </w:r>
+      <w:r>
+        <w:rPr>
+          <w:bCs/>
+          <w:b/>
+        </w:rPr>
+        <w:t xml:space="preserve"> </w:t>
+      </w:r>
+      <w:r>
+        <w:rPr>
+          <w:bCs/>
+          <w:b/>
+        </w:rPr>
+        <w:t xml:space="preserve">line</w:t>
+      </w:r>
+      <w:r>
+        <w:t xml:space="preserve"> </w:t>
+      </w:r>
+      <w:r>
+        <w:t xml:space="preserve">from the</w:t>
+      </w:r>
+      <w:r>
+        <w:t xml:space="preserve"> </w:t>
+      </w:r>
+      <w:r>
+        <w:rPr>
+          <w:rStyle w:val="VerbatimChar"/>
+        </w:rPr>
+        <w:t xml:space="preserve">generator client</w:t>
+      </w:r>
+      <w:r>
+        <w:t xml:space="preserve"> </w:t>
+      </w:r>
+      <w:r>
+        <w:t xml:space="preserve">block:</w:t>
       </w:r>
     </w:p>
     <w:p>
@@ -2296,7 +2310,43 @@
         <w:rPr>
           <w:rStyle w:val="VerbatimChar"/>
         </w:rPr>
-        <w:t xml:space="preserve">output = "/home/ubuntu/health_logger/nextjs_space/node_modules/.prisma/client"</w:t>
+        <w:t xml:space="preserve">generator client {</w:t>
+      </w:r>
+      <w:r>
+        <w:br/>
+      </w:r>
+      <w:r>
+        <w:rPr>
+          <w:rStyle w:val="VerbatimChar"/>
+        </w:rPr>
+        <w:t xml:space="preserve">    provider = "prisma-client-js"</w:t>
+      </w:r>
+      <w:r>
+        <w:br/>
+      </w:r>
+      <w:r>
+        <w:rPr>
+          <w:rStyle w:val="VerbatimChar"/>
+        </w:rPr>
+        <w:t xml:space="preserve">    binaryTargets = ["native", "linux-musl-arm64-openssl-3.0.x"]</w:t>
+      </w:r>
+      <w:r>
+        <w:br/>
+      </w:r>
+      <w:r>
+        <w:rPr>
+          <w:rStyle w:val="VerbatimChar"/>
+        </w:rPr>
+        <w:t xml:space="preserve">    // ← remove the output = "..." line — Prisma defaults to node_modules/.prisma/client</w:t>
+      </w:r>
+      <w:r>
+        <w:br/>
+      </w:r>
+      <w:r>
+        <w:rPr>
+          <w:rStyle w:val="VerbatimChar"/>
+        </w:rPr>
+        <w:t xml:space="preserve">}</w:t>
       </w:r>
     </w:p>
     <w:p>
@@ -2304,53 +2354,22 @@
         <w:pStyle w:val="FirstParagraph"/>
       </w:pPr>
       <w:r>
-        <w:t xml:space="preserve">To:</w:t>
-      </w:r>
-    </w:p>
-    <w:p>
-      <w:pPr>
-        <w:pStyle w:val="SourceCode"/>
-      </w:pPr>
-      <w:r>
-        <w:rPr>
-          <w:rStyle w:val="VerbatimChar"/>
-        </w:rPr>
-        <w:t xml:space="preserve">output = "../node_modules/.prisma/client"</w:t>
-      </w:r>
-    </w:p>
-    <w:p>
-      <w:pPr>
-        <w:pStyle w:val="FirstParagraph"/>
-      </w:pPr>
-      <w:r>
-        <w:t xml:space="preserve">(Or simply remove the</w:t>
-      </w:r>
-      <w:r>
-        <w:t xml:space="preserve"> </w:t>
-      </w:r>
-      <w:r>
-        <w:rPr>
-          <w:rStyle w:val="VerbatimChar"/>
-        </w:rPr>
-        <w:t xml:space="preserve">output</w:t>
-      </w:r>
-      <w:r>
-        <w:t xml:space="preserve"> </w:t>
-      </w:r>
-      <w:r>
-        <w:t xml:space="preserve">line entirely — Prisma defaults to</w:t>
-      </w:r>
-      <w:r>
-        <w:t xml:space="preserve"> </w:t>
-      </w:r>
-      <w:r>
-        <w:rPr>
-          <w:rStyle w:val="VerbatimChar"/>
-        </w:rPr>
-        <w:t xml:space="preserve">node_modules/.prisma/client</w:t>
-      </w:r>
-      <w:r>
-        <w:t xml:space="preserve">)</w:t>
+        <w:t xml:space="preserve">Then run</w:t>
+      </w:r>
+      <w:r>
+        <w:t xml:space="preserve"> </w:t>
+      </w:r>
+      <w:r>
+        <w:rPr>
+          <w:rStyle w:val="VerbatimChar"/>
+        </w:rPr>
+        <w:t xml:space="preserve">yarn prisma generate</w:t>
+      </w:r>
+      <w:r>
+        <w:t xml:space="preserve"> </w:t>
+      </w:r>
+      <w:r>
+        <w:t xml:space="preserve">to regenerate the client.</w:t>
       </w:r>
     </w:p>
     <w:p>
@@ -2375,25 +2394,332 @@
         <w:pStyle w:val="FirstParagraph"/>
       </w:pPr>
       <w:r>
-        <w:t xml:space="preserve">The</w:t>
-      </w:r>
-      <w:r>
-        <w:t xml:space="preserve"> </w:t>
-      </w:r>
-      <w:r>
-        <w:rPr>
-          <w:rStyle w:val="VerbatimChar"/>
-        </w:rPr>
-        <w:t xml:space="preserve">experimental.outputFileTracingRoot</w:t>
-      </w:r>
-      <w:r>
-        <w:t xml:space="preserve"> </w:t>
-      </w:r>
-      <w:r>
-        <w:t xml:space="preserve">and</w:t>
-      </w:r>
-      <w:r>
-        <w:t xml:space="preserve"> </w:t>
+        <w:t xml:space="preserve">Replace the contents of</w:t>
+      </w:r>
+      <w:r>
+        <w:t xml:space="preserve"> </w:t>
+      </w:r>
+      <w:r>
+        <w:rPr>
+          <w:rStyle w:val="VerbatimChar"/>
+        </w:rPr>
+        <w:t xml:space="preserve">next.config.js</w:t>
+      </w:r>
+      <w:r>
+        <w:t xml:space="preserve"> </w:t>
+      </w:r>
+      <w:r>
+        <w:t xml:space="preserve">with this clean version:</w:t>
+      </w:r>
+    </w:p>
+    <w:p>
+      <w:pPr>
+        <w:pStyle w:val="SourceCode"/>
+      </w:pPr>
+      <w:r>
+        <w:rPr>
+          <w:rStyle w:val="CommentTok"/>
+        </w:rPr>
+        <w:t xml:space="preserve">/** </w:t>
+      </w:r>
+      <w:r>
+        <w:rPr>
+          <w:rStyle w:val="AnnotationTok"/>
+        </w:rPr>
+        <w:t xml:space="preserve">@type</w:t>
+      </w:r>
+      <w:r>
+        <w:rPr>
+          <w:rStyle w:val="CommentTok"/>
+        </w:rPr>
+        <w:t xml:space="preserve"> {import('next').NextConfig} */</w:t>
+      </w:r>
+      <w:r>
+        <w:br/>
+      </w:r>
+      <w:r>
+        <w:rPr>
+          <w:rStyle w:val="KeywordTok"/>
+        </w:rPr>
+        <w:t xml:space="preserve">const</w:t>
+      </w:r>
+      <w:r>
+        <w:rPr>
+          <w:rStyle w:val="NormalTok"/>
+        </w:rPr>
+        <w:t xml:space="preserve"> nextConfig </w:t>
+      </w:r>
+      <w:r>
+        <w:rPr>
+          <w:rStyle w:val="OperatorTok"/>
+        </w:rPr>
+        <w:t xml:space="preserve">=</w:t>
+      </w:r>
+      <w:r>
+        <w:rPr>
+          <w:rStyle w:val="NormalTok"/>
+        </w:rPr>
+        <w:t xml:space="preserve"> {</w:t>
+      </w:r>
+      <w:r>
+        <w:br/>
+      </w:r>
+      <w:r>
+        <w:rPr>
+          <w:rStyle w:val="NormalTok"/>
+        </w:rPr>
+        <w:t xml:space="preserve">  </w:t>
+      </w:r>
+      <w:r>
+        <w:rPr>
+          <w:rStyle w:val="DataTypeTok"/>
+        </w:rPr>
+        <w:t xml:space="preserve">eslint</w:t>
+      </w:r>
+      <w:r>
+        <w:rPr>
+          <w:rStyle w:val="OperatorTok"/>
+        </w:rPr>
+        <w:t xml:space="preserve">:</w:t>
+      </w:r>
+      <w:r>
+        <w:rPr>
+          <w:rStyle w:val="NormalTok"/>
+        </w:rPr>
+        <w:t xml:space="preserve"> { </w:t>
+      </w:r>
+      <w:r>
+        <w:rPr>
+          <w:rStyle w:val="DataTypeTok"/>
+        </w:rPr>
+        <w:t xml:space="preserve">ignoreDuringBuilds</w:t>
+      </w:r>
+      <w:r>
+        <w:rPr>
+          <w:rStyle w:val="OperatorTok"/>
+        </w:rPr>
+        <w:t xml:space="preserve">:</w:t>
+      </w:r>
+      <w:r>
+        <w:rPr>
+          <w:rStyle w:val="NormalTok"/>
+        </w:rPr>
+        <w:t xml:space="preserve"> </w:t>
+      </w:r>
+      <w:r>
+        <w:rPr>
+          <w:rStyle w:val="KeywordTok"/>
+        </w:rPr>
+        <w:t xml:space="preserve">true</w:t>
+      </w:r>
+      <w:r>
+        <w:rPr>
+          <w:rStyle w:val="NormalTok"/>
+        </w:rPr>
+        <w:t xml:space="preserve"> }</w:t>
+      </w:r>
+      <w:r>
+        <w:rPr>
+          <w:rStyle w:val="OperatorTok"/>
+        </w:rPr>
+        <w:t xml:space="preserve">,</w:t>
+      </w:r>
+      <w:r>
+        <w:br/>
+      </w:r>
+      <w:r>
+        <w:rPr>
+          <w:rStyle w:val="NormalTok"/>
+        </w:rPr>
+        <w:t xml:space="preserve">  </w:t>
+      </w:r>
+      <w:r>
+        <w:rPr>
+          <w:rStyle w:val="DataTypeTok"/>
+        </w:rPr>
+        <w:t xml:space="preserve">typescript</w:t>
+      </w:r>
+      <w:r>
+        <w:rPr>
+          <w:rStyle w:val="OperatorTok"/>
+        </w:rPr>
+        <w:t xml:space="preserve">:</w:t>
+      </w:r>
+      <w:r>
+        <w:rPr>
+          <w:rStyle w:val="NormalTok"/>
+        </w:rPr>
+        <w:t xml:space="preserve"> { </w:t>
+      </w:r>
+      <w:r>
+        <w:rPr>
+          <w:rStyle w:val="DataTypeTok"/>
+        </w:rPr>
+        <w:t xml:space="preserve">ignoreBuildErrors</w:t>
+      </w:r>
+      <w:r>
+        <w:rPr>
+          <w:rStyle w:val="OperatorTok"/>
+        </w:rPr>
+        <w:t xml:space="preserve">:</w:t>
+      </w:r>
+      <w:r>
+        <w:rPr>
+          <w:rStyle w:val="NormalTok"/>
+        </w:rPr>
+        <w:t xml:space="preserve"> </w:t>
+      </w:r>
+      <w:r>
+        <w:rPr>
+          <w:rStyle w:val="KeywordTok"/>
+        </w:rPr>
+        <w:t xml:space="preserve">false</w:t>
+      </w:r>
+      <w:r>
+        <w:rPr>
+          <w:rStyle w:val="NormalTok"/>
+        </w:rPr>
+        <w:t xml:space="preserve"> }</w:t>
+      </w:r>
+      <w:r>
+        <w:rPr>
+          <w:rStyle w:val="OperatorTok"/>
+        </w:rPr>
+        <w:t xml:space="preserve">,</w:t>
+      </w:r>
+      <w:r>
+        <w:br/>
+      </w:r>
+      <w:r>
+        <w:rPr>
+          <w:rStyle w:val="NormalTok"/>
+        </w:rPr>
+        <w:t xml:space="preserve">  </w:t>
+      </w:r>
+      <w:r>
+        <w:rPr>
+          <w:rStyle w:val="DataTypeTok"/>
+        </w:rPr>
+        <w:t xml:space="preserve">images</w:t>
+      </w:r>
+      <w:r>
+        <w:rPr>
+          <w:rStyle w:val="OperatorTok"/>
+        </w:rPr>
+        <w:t xml:space="preserve">:</w:t>
+      </w:r>
+      <w:r>
+        <w:rPr>
+          <w:rStyle w:val="NormalTok"/>
+        </w:rPr>
+        <w:t xml:space="preserve"> { </w:t>
+      </w:r>
+      <w:r>
+        <w:rPr>
+          <w:rStyle w:val="DataTypeTok"/>
+        </w:rPr>
+        <w:t xml:space="preserve">unoptimized</w:t>
+      </w:r>
+      <w:r>
+        <w:rPr>
+          <w:rStyle w:val="OperatorTok"/>
+        </w:rPr>
+        <w:t xml:space="preserve">:</w:t>
+      </w:r>
+      <w:r>
+        <w:rPr>
+          <w:rStyle w:val="NormalTok"/>
+        </w:rPr>
+        <w:t xml:space="preserve"> </w:t>
+      </w:r>
+      <w:r>
+        <w:rPr>
+          <w:rStyle w:val="KeywordTok"/>
+        </w:rPr>
+        <w:t xml:space="preserve">true</w:t>
+      </w:r>
+      <w:r>
+        <w:rPr>
+          <w:rStyle w:val="NormalTok"/>
+        </w:rPr>
+        <w:t xml:space="preserve"> }</w:t>
+      </w:r>
+      <w:r>
+        <w:rPr>
+          <w:rStyle w:val="OperatorTok"/>
+        </w:rPr>
+        <w:t xml:space="preserve">,</w:t>
+      </w:r>
+      <w:r>
+        <w:br/>
+      </w:r>
+      <w:r>
+        <w:rPr>
+          <w:rStyle w:val="NormalTok"/>
+        </w:rPr>
+        <w:t xml:space="preserve">}</w:t>
+      </w:r>
+      <w:r>
+        <w:rPr>
+          <w:rStyle w:val="OperatorTok"/>
+        </w:rPr>
+        <w:t xml:space="preserve">;</w:t>
+      </w:r>
+      <w:r>
+        <w:br/>
+      </w:r>
+      <w:r>
+        <w:br/>
+      </w:r>
+      <w:r>
+        <w:rPr>
+          <w:rStyle w:val="NormalTok"/>
+        </w:rPr>
+        <w:t xml:space="preserve">module</w:t>
+      </w:r>
+      <w:r>
+        <w:rPr>
+          <w:rStyle w:val="OperatorTok"/>
+        </w:rPr>
+        <w:t xml:space="preserve">.</w:t>
+      </w:r>
+      <w:r>
+        <w:rPr>
+          <w:rStyle w:val="AttributeTok"/>
+        </w:rPr>
+        <w:t xml:space="preserve">exports</w:t>
+      </w:r>
+      <w:r>
+        <w:rPr>
+          <w:rStyle w:val="NormalTok"/>
+        </w:rPr>
+        <w:t xml:space="preserve"> </w:t>
+      </w:r>
+      <w:r>
+        <w:rPr>
+          <w:rStyle w:val="OperatorTok"/>
+        </w:rPr>
+        <w:t xml:space="preserve">=</w:t>
+      </w:r>
+      <w:r>
+        <w:rPr>
+          <w:rStyle w:val="NormalTok"/>
+        </w:rPr>
+        <w:t xml:space="preserve"> nextConfig</w:t>
+      </w:r>
+      <w:r>
+        <w:rPr>
+          <w:rStyle w:val="OperatorTok"/>
+        </w:rPr>
+        <w:t xml:space="preserve">;</w:t>
+      </w:r>
+    </w:p>
+    <w:p>
+      <w:pPr>
+        <w:pStyle w:val="FirstParagraph"/>
+      </w:pPr>
+      <w:r>
+        <w:t xml:space="preserve">The original has platform-specific settings (</w:t>
       </w:r>
       <w:r>
         <w:rPr>
@@ -2402,10 +2728,7 @@
         <w:t xml:space="preserve">NEXT_DIST_DIR</w:t>
       </w:r>
       <w:r>
-        <w:t xml:space="preserve"> </w:t>
-      </w:r>
-      <w:r>
-        <w:t xml:space="preserve">/</w:t>
+        <w:t xml:space="preserve">,</w:t>
       </w:r>
       <w:r>
         <w:t xml:space="preserve"> </w:t>
@@ -2417,327 +2740,19 @@
         <w:t xml:space="preserve">NEXT_OUTPUT_MODE</w:t>
       </w:r>
       <w:r>
-        <w:t xml:space="preserve"> </w:t>
-      </w:r>
-      <w:r>
-        <w:t xml:space="preserve">env vars are Abacus-specific. Simplify</w:t>
-      </w:r>
-      <w:r>
-        <w:t xml:space="preserve"> </w:t>
-      </w:r>
-      <w:r>
-        <w:rPr>
-          <w:rStyle w:val="VerbatimChar"/>
-        </w:rPr>
-        <w:t xml:space="preserve">next.config.js</w:t>
-      </w:r>
-      <w:r>
-        <w:t xml:space="preserve"> </w:t>
-      </w:r>
-      <w:r>
-        <w:t xml:space="preserve">to:</w:t>
-      </w:r>
-    </w:p>
-    <w:p>
-      <w:pPr>
-        <w:pStyle w:val="SourceCode"/>
-      </w:pPr>
-      <w:r>
-        <w:rPr>
-          <w:rStyle w:val="CommentTok"/>
-        </w:rPr>
-        <w:t xml:space="preserve">/** </w:t>
-      </w:r>
-      <w:r>
-        <w:rPr>
-          <w:rStyle w:val="AnnotationTok"/>
-        </w:rPr>
-        <w:t xml:space="preserve">@type</w:t>
-      </w:r>
-      <w:r>
-        <w:rPr>
-          <w:rStyle w:val="CommentTok"/>
-        </w:rPr>
-        <w:t xml:space="preserve"> {import('next').NextConfig} */</w:t>
-      </w:r>
-      <w:r>
-        <w:br/>
-      </w:r>
-      <w:r>
-        <w:rPr>
-          <w:rStyle w:val="KeywordTok"/>
-        </w:rPr>
-        <w:t xml:space="preserve">const</w:t>
-      </w:r>
-      <w:r>
-        <w:rPr>
-          <w:rStyle w:val="NormalTok"/>
-        </w:rPr>
-        <w:t xml:space="preserve"> nextConfig </w:t>
-      </w:r>
-      <w:r>
-        <w:rPr>
-          <w:rStyle w:val="OperatorTok"/>
-        </w:rPr>
-        <w:t xml:space="preserve">=</w:t>
-      </w:r>
-      <w:r>
-        <w:rPr>
-          <w:rStyle w:val="NormalTok"/>
-        </w:rPr>
-        <w:t xml:space="preserve"> {</w:t>
-      </w:r>
-      <w:r>
-        <w:br/>
-      </w:r>
-      <w:r>
-        <w:rPr>
-          <w:rStyle w:val="NormalTok"/>
-        </w:rPr>
-        <w:t xml:space="preserve">  </w:t>
-      </w:r>
-      <w:r>
-        <w:rPr>
-          <w:rStyle w:val="DataTypeTok"/>
-        </w:rPr>
-        <w:t xml:space="preserve">eslint</w:t>
-      </w:r>
-      <w:r>
-        <w:rPr>
-          <w:rStyle w:val="OperatorTok"/>
-        </w:rPr>
-        <w:t xml:space="preserve">:</w:t>
-      </w:r>
-      <w:r>
-        <w:rPr>
-          <w:rStyle w:val="NormalTok"/>
-        </w:rPr>
-        <w:t xml:space="preserve"> { </w:t>
-      </w:r>
-      <w:r>
-        <w:rPr>
-          <w:rStyle w:val="DataTypeTok"/>
-        </w:rPr>
-        <w:t xml:space="preserve">ignoreDuringBuilds</w:t>
-      </w:r>
-      <w:r>
-        <w:rPr>
-          <w:rStyle w:val="OperatorTok"/>
-        </w:rPr>
-        <w:t xml:space="preserve">:</w:t>
-      </w:r>
-      <w:r>
-        <w:rPr>
-          <w:rStyle w:val="NormalTok"/>
-        </w:rPr>
-        <w:t xml:space="preserve"> </w:t>
-      </w:r>
-      <w:r>
-        <w:rPr>
-          <w:rStyle w:val="KeywordTok"/>
-        </w:rPr>
-        <w:t xml:space="preserve">true</w:t>
-      </w:r>
-      <w:r>
-        <w:rPr>
-          <w:rStyle w:val="NormalTok"/>
-        </w:rPr>
-        <w:t xml:space="preserve"> }</w:t>
-      </w:r>
-      <w:r>
-        <w:rPr>
-          <w:rStyle w:val="OperatorTok"/>
-        </w:rPr>
         <w:t xml:space="preserve">,</w:t>
       </w:r>
       <w:r>
-        <w:br/>
-      </w:r>
-      <w:r>
-        <w:rPr>
-          <w:rStyle w:val="NormalTok"/>
-        </w:rPr>
-        <w:t xml:space="preserve">  </w:t>
-      </w:r>
-      <w:r>
-        <w:rPr>
-          <w:rStyle w:val="DataTypeTok"/>
-        </w:rPr>
-        <w:t xml:space="preserve">typescript</w:t>
-      </w:r>
-      <w:r>
-        <w:rPr>
-          <w:rStyle w:val="OperatorTok"/>
-        </w:rPr>
-        <w:t xml:space="preserve">:</w:t>
-      </w:r>
-      <w:r>
-        <w:rPr>
-          <w:rStyle w:val="NormalTok"/>
-        </w:rPr>
-        <w:t xml:space="preserve"> { </w:t>
-      </w:r>
-      <w:r>
-        <w:rPr>
-          <w:rStyle w:val="DataTypeTok"/>
-        </w:rPr>
-        <w:t xml:space="preserve">ignoreBuildErrors</w:t>
-      </w:r>
-      <w:r>
-        <w:rPr>
-          <w:rStyle w:val="OperatorTok"/>
-        </w:rPr>
-        <w:t xml:space="preserve">:</w:t>
-      </w:r>
-      <w:r>
-        <w:rPr>
-          <w:rStyle w:val="NormalTok"/>
-        </w:rPr>
-        <w:t xml:space="preserve"> </w:t>
-      </w:r>
-      <w:r>
-        <w:rPr>
-          <w:rStyle w:val="KeywordTok"/>
-        </w:rPr>
-        <w:t xml:space="preserve">false</w:t>
-      </w:r>
-      <w:r>
-        <w:rPr>
-          <w:rStyle w:val="NormalTok"/>
-        </w:rPr>
-        <w:t xml:space="preserve"> }</w:t>
-      </w:r>
-      <w:r>
-        <w:rPr>
-          <w:rStyle w:val="OperatorTok"/>
-        </w:rPr>
-        <w:t xml:space="preserve">,</w:t>
-      </w:r>
-      <w:r>
-        <w:br/>
-      </w:r>
-      <w:r>
-        <w:rPr>
-          <w:rStyle w:val="NormalTok"/>
-        </w:rPr>
-        <w:t xml:space="preserve">  </w:t>
-      </w:r>
-      <w:r>
-        <w:rPr>
-          <w:rStyle w:val="DataTypeTok"/>
-        </w:rPr>
-        <w:t xml:space="preserve">images</w:t>
-      </w:r>
-      <w:r>
-        <w:rPr>
-          <w:rStyle w:val="OperatorTok"/>
-        </w:rPr>
-        <w:t xml:space="preserve">:</w:t>
-      </w:r>
-      <w:r>
-        <w:rPr>
-          <w:rStyle w:val="NormalTok"/>
-        </w:rPr>
-        <w:t xml:space="preserve"> { </w:t>
-      </w:r>
-      <w:r>
-        <w:rPr>
-          <w:rStyle w:val="DataTypeTok"/>
-        </w:rPr>
-        <w:t xml:space="preserve">unoptimized</w:t>
-      </w:r>
-      <w:r>
-        <w:rPr>
-          <w:rStyle w:val="OperatorTok"/>
-        </w:rPr>
-        <w:t xml:space="preserve">:</w:t>
-      </w:r>
-      <w:r>
-        <w:rPr>
-          <w:rStyle w:val="NormalTok"/>
-        </w:rPr>
-        <w:t xml:space="preserve"> </w:t>
-      </w:r>
-      <w:r>
-        <w:rPr>
-          <w:rStyle w:val="KeywordTok"/>
-        </w:rPr>
-        <w:t xml:space="preserve">true</w:t>
-      </w:r>
-      <w:r>
-        <w:rPr>
-          <w:rStyle w:val="NormalTok"/>
-        </w:rPr>
-        <w:t xml:space="preserve"> }</w:t>
-      </w:r>
-      <w:r>
-        <w:rPr>
-          <w:rStyle w:val="OperatorTok"/>
-        </w:rPr>
-        <w:t xml:space="preserve">,</w:t>
-      </w:r>
-      <w:r>
-        <w:br/>
-      </w:r>
-      <w:r>
-        <w:rPr>
-          <w:rStyle w:val="NormalTok"/>
-        </w:rPr>
-        <w:t xml:space="preserve">}</w:t>
-      </w:r>
-      <w:r>
-        <w:rPr>
-          <w:rStyle w:val="OperatorTok"/>
-        </w:rPr>
-        <w:t xml:space="preserve">;</w:t>
-      </w:r>
-      <w:r>
-        <w:br/>
-      </w:r>
-      <w:r>
-        <w:br/>
-      </w:r>
-      <w:r>
-        <w:rPr>
-          <w:rStyle w:val="NormalTok"/>
-        </w:rPr>
-        <w:t xml:space="preserve">module</w:t>
-      </w:r>
-      <w:r>
-        <w:rPr>
-          <w:rStyle w:val="OperatorTok"/>
-        </w:rPr>
-        <w:t xml:space="preserve">.</w:t>
-      </w:r>
-      <w:r>
-        <w:rPr>
-          <w:rStyle w:val="AttributeTok"/>
-        </w:rPr>
-        <w:t xml:space="preserve">exports</w:t>
-      </w:r>
-      <w:r>
-        <w:rPr>
-          <w:rStyle w:val="NormalTok"/>
-        </w:rPr>
-        <w:t xml:space="preserve"> </w:t>
-      </w:r>
-      <w:r>
-        <w:rPr>
-          <w:rStyle w:val="OperatorTok"/>
-        </w:rPr>
-        <w:t xml:space="preserve">=</w:t>
-      </w:r>
-      <w:r>
-        <w:rPr>
-          <w:rStyle w:val="NormalTok"/>
-        </w:rPr>
-        <w:t xml:space="preserve"> nextConfig</w:t>
-      </w:r>
-      <w:r>
-        <w:rPr>
-          <w:rStyle w:val="OperatorTok"/>
-        </w:rPr>
-        <w:t xml:space="preserve">;</w:t>
+        <w:t xml:space="preserve"> </w:t>
+      </w:r>
+      <w:r>
+        <w:rPr>
+          <w:rStyle w:val="VerbatimChar"/>
+        </w:rPr>
+        <w:t xml:space="preserve">outputFileTracingRoot</w:t>
+      </w:r>
+      <w:r>
+        <w:t xml:space="preserve">) that are not needed on your VPS.</w:t>
       </w:r>
     </w:p>
     <w:p>
@@ -2748,13 +2763,13 @@
       </w:r>
     </w:p>
     <w:bookmarkEnd w:id="34"/>
-    <w:bookmarkStart w:id="35" w:name="summary-of-changes-needed"/>
+    <w:bookmarkStart w:id="35" w:name="X2bc3b3b0b27cc69a1b4bf16575ab90158af3d09"/>
     <w:p>
       <w:pPr>
         <w:pStyle w:val="Heading2"/>
       </w:pPr>
       <w:r>
-        <w:t xml:space="preserve">Summary of Changes Needed</w:t>
+        <w:t xml:space="preserve">Summary of What’s Ready vs. What You Need to Do</w:t>
       </w:r>
     </w:p>
     <w:tbl>
@@ -2780,7 +2795,7 @@
               <w:jc w:val="left"/>
             </w:pPr>
             <w:r>
-              <w:t xml:space="preserve">What</w:t>
+              <w:t xml:space="preserve">Component</w:t>
             </w:r>
           </w:p>
         </w:tc>
@@ -2792,7 +2807,7 @@
               <w:jc w:val="left"/>
             </w:pPr>
             <w:r>
-              <w:t xml:space="preserve">Current (Abacus)</w:t>
+              <w:t xml:space="preserve">Status</w:t>
             </w:r>
           </w:p>
         </w:tc>
@@ -2804,7 +2819,7 @@
               <w:jc w:val="left"/>
             </w:pPr>
             <w:r>
-              <w:t xml:space="preserve">Self-Hosted Replacement</w:t>
+              <w:t xml:space="preserve">Action on VPS</w:t>
             </w:r>
           </w:p>
         </w:tc>
@@ -2818,7 +2833,7 @@
               <w:jc w:val="left"/>
             </w:pPr>
             <w:r>
-              <w:t xml:space="preserve">LLM API</w:t>
+              <w:t xml:space="preserve">✅ LLM (Ollama Cloud)</w:t>
             </w:r>
           </w:p>
         </w:tc>
@@ -2831,9 +2846,10 @@
             </w:pPr>
             <w:r>
               <w:rPr>
-                <w:rStyle w:val="VerbatimChar"/>
+                <w:bCs/>
+                <w:b/>
               </w:rPr>
-              <w:t xml:space="preserve">ollama.com/v1/chat/completions</w:t>
+              <w:t xml:space="preserve">Ready</w:t>
             </w:r>
           </w:p>
         </w:tc>
@@ -2845,7 +2861,22 @@
               <w:jc w:val="left"/>
             </w:pPr>
             <w:r>
-              <w:t xml:space="preserve">Already configured for Ollama Cloud</w:t>
+              <w:t xml:space="preserve">Just set</w:t>
+            </w:r>
+            <w:r>
+              <w:t xml:space="preserve"> </w:t>
+            </w:r>
+            <w:r>
+              <w:rPr>
+                <w:rStyle w:val="VerbatimChar"/>
+              </w:rPr>
+              <w:t xml:space="preserve">OLLAMA_API_KEY</w:t>
+            </w:r>
+            <w:r>
+              <w:t xml:space="preserve"> </w:t>
+            </w:r>
+            <w:r>
+              <w:t xml:space="preserve">in .env</w:t>
             </w:r>
           </w:p>
         </w:tc>
@@ -2859,7 +2890,7 @@
               <w:jc w:val="left"/>
             </w:pPr>
             <w:r>
-              <w:t xml:space="preserve">LLM model</w:t>
+              <w:t xml:space="preserve">✅ Email (Nodemailer)</w:t>
             </w:r>
           </w:p>
         </w:tc>
@@ -2872,9 +2903,10 @@
             </w:pPr>
             <w:r>
               <w:rPr>
-                <w:rStyle w:val="VerbatimChar"/>
+                <w:bCs/>
+                <w:b/>
               </w:rPr>
-              <w:t xml:space="preserve">gemma4:31b-cloud</w:t>
+              <w:t xml:space="preserve">Ready</w:t>
             </w:r>
           </w:p>
         </w:tc>
@@ -2886,7 +2918,7 @@
               <w:jc w:val="left"/>
             </w:pPr>
             <w:r>
-              <w:t xml:space="preserve">Already configured (vision-capable)</w:t>
+              <w:t xml:space="preserve">Just set SMTP env vars in .env</w:t>
             </w:r>
           </w:p>
         </w:tc>
@@ -2900,7 +2932,7 @@
               <w:jc w:val="left"/>
             </w:pPr>
             <w:r>
-              <w:t xml:space="preserve">Email sending</w:t>
+              <w:t xml:space="preserve">✅ Image capture + vision</w:t>
             </w:r>
           </w:p>
         </w:tc>
@@ -2912,7 +2944,11 @@
               <w:jc w:val="left"/>
             </w:pPr>
             <w:r>
-              <w:t xml:space="preserve">Nodemailer + SMTP</w:t>
+              <w:rPr>
+                <w:bCs/>
+                <w:b/>
+              </w:rPr>
+              <w:t xml:space="preserve">Ready</w:t>
             </w:r>
           </w:p>
         </w:tc>
@@ -2924,7 +2960,7 @@
               <w:jc w:val="left"/>
             </w:pPr>
             <w:r>
-              <w:t xml:space="preserve">Already configured — just add SMTP env vars</w:t>
+              <w:t xml:space="preserve">Nothing to do</w:t>
             </w:r>
           </w:p>
         </w:tc>
@@ -2938,7 +2974,7 @@
               <w:jc w:val="left"/>
             </w:pPr>
             <w:r>
-              <w:t xml:space="preserve">Push cron jobs</w:t>
+              <w:t xml:space="preserve">✅ Layout (script tag)</w:t>
             </w:r>
           </w:p>
         </w:tc>
@@ -2950,7 +2986,11 @@
               <w:jc w:val="left"/>
             </w:pPr>
             <w:r>
-              <w:t xml:space="preserve">Abacus scheduled tasks</w:t>
+              <w:rPr>
+                <w:bCs/>
+                <w:b/>
+              </w:rPr>
+              <w:t xml:space="preserve">Ready</w:t>
             </w:r>
           </w:p>
         </w:tc>
@@ -2962,7 +3002,7 @@
               <w:jc w:val="left"/>
             </w:pPr>
             <w:r>
-              <w:t xml:space="preserve">Linux crontab</w:t>
+              <w:t xml:space="preserve">Already removed</w:t>
             </w:r>
           </w:p>
         </w:tc>
@@ -2976,7 +3016,7 @@
               <w:jc w:val="left"/>
             </w:pPr>
             <w:r>
-              <w:t xml:space="preserve">Database</w:t>
+              <w:t xml:space="preserve">✅ All Abacus code refs</w:t>
             </w:r>
           </w:p>
         </w:tc>
@@ -2988,7 +3028,11 @@
               <w:jc w:val="left"/>
             </w:pPr>
             <w:r>
-              <w:t xml:space="preserve">Abacus-hosted PostgreSQL</w:t>
+              <w:rPr>
+                <w:bCs/>
+                <w:b/>
+              </w:rPr>
+              <w:t xml:space="preserve">Ready</w:t>
             </w:r>
           </w:p>
         </w:tc>
@@ -3000,7 +3044,7 @@
               <w:jc w:val="left"/>
             </w:pPr>
             <w:r>
-              <w:t xml:space="preserve">Self-hosted PostgreSQL</w:t>
+              <w:t xml:space="preserve">Zero references remaining</w:t>
             </w:r>
           </w:p>
         </w:tc>
@@ -3014,7 +3058,7 @@
               <w:jc w:val="left"/>
             </w:pPr>
             <w:r>
-              <w:t xml:space="preserve">VAPID keys</w:t>
+              <w:t xml:space="preserve">⚙️ Push cron jobs</w:t>
             </w:r>
           </w:p>
         </w:tc>
@@ -3026,7 +3070,92 @@
               <w:jc w:val="left"/>
             </w:pPr>
             <w:r>
-              <w:t xml:space="preserve">Abacus .env</w:t>
+              <w:t xml:space="preserve">Code ready</w:t>
+            </w:r>
+          </w:p>
+        </w:tc>
+        <w:tc>
+          <w:tcPr/>
+          <w:p>
+            <w:pPr>
+              <w:pStyle w:val="Compact"/>
+              <w:jc w:val="left"/>
+            </w:pPr>
+            <w:r>
+              <w:t xml:space="preserve">Add 3 crontab lines (see section 7)</w:t>
+            </w:r>
+          </w:p>
+        </w:tc>
+      </w:tr>
+      <w:tr>
+        <w:tc>
+          <w:tcPr/>
+          <w:p>
+            <w:pPr>
+              <w:pStyle w:val="Compact"/>
+              <w:jc w:val="left"/>
+            </w:pPr>
+            <w:r>
+              <w:t xml:space="preserve">⚙️ Database</w:t>
+            </w:r>
+          </w:p>
+        </w:tc>
+        <w:tc>
+          <w:tcPr/>
+          <w:p>
+            <w:pPr>
+              <w:pStyle w:val="Compact"/>
+              <w:jc w:val="left"/>
+            </w:pPr>
+            <w:r>
+              <w:t xml:space="preserve">Code ready</w:t>
+            </w:r>
+          </w:p>
+        </w:tc>
+        <w:tc>
+          <w:tcPr/>
+          <w:p>
+            <w:pPr>
+              <w:pStyle w:val="Compact"/>
+              <w:jc w:val="left"/>
+            </w:pPr>
+            <w:r>
+              <w:t xml:space="preserve">Set up PostgreSQL +</w:t>
+            </w:r>
+            <w:r>
+              <w:t xml:space="preserve"> </w:t>
+            </w:r>
+            <w:r>
+              <w:rPr>
+                <w:rStyle w:val="VerbatimChar"/>
+              </w:rPr>
+              <w:t xml:space="preserve">DATABASE_URL</w:t>
+            </w:r>
+          </w:p>
+        </w:tc>
+      </w:tr>
+      <w:tr>
+        <w:tc>
+          <w:tcPr/>
+          <w:p>
+            <w:pPr>
+              <w:pStyle w:val="Compact"/>
+              <w:jc w:val="left"/>
+            </w:pPr>
+            <w:r>
+              <w:t xml:space="preserve">⚙️ VAPID keys</w:t>
+            </w:r>
+          </w:p>
+        </w:tc>
+        <w:tc>
+          <w:tcPr/>
+          <w:p>
+            <w:pPr>
+              <w:pStyle w:val="Compact"/>
+              <w:jc w:val="left"/>
+            </w:pPr>
+            <w:r>
+              <w:t xml:space="preserve">Code ready</w:t>
             </w:r>
           </w:p>
         </w:tc>
@@ -3061,7 +3190,7 @@
               <w:jc w:val="left"/>
             </w:pPr>
             <w:r>
-              <w:t xml:space="preserve">Prisma output path</w:t>
+              <w:t xml:space="preserve">⚙️ Prisma output path</w:t>
             </w:r>
           </w:p>
         </w:tc>
@@ -3073,7 +3202,7 @@
               <w:jc w:val="left"/>
             </w:pPr>
             <w:r>
-              <w:t xml:space="preserve">Hardcoded absolute path</w:t>
+              <w:t xml:space="preserve">Needs edit</w:t>
             </w:r>
           </w:p>
         </w:tc>
@@ -3085,7 +3214,7 @@
               <w:jc w:val="left"/>
             </w:pPr>
             <w:r>
-              <w:t xml:space="preserve">Relative</w:t>
+              <w:t xml:space="preserve">Remove</w:t>
             </w:r>
             <w:r>
               <w:t xml:space="preserve"> </w:t>
@@ -3094,7 +3223,13 @@
               <w:rPr>
                 <w:rStyle w:val="VerbatimChar"/>
               </w:rPr>
-              <w:t xml:space="preserve">../node_modules/.prisma/client</w:t>
+              <w:t xml:space="preserve">output</w:t>
+            </w:r>
+            <w:r>
+              <w:t xml:space="preserve"> </w:t>
+            </w:r>
+            <w:r>
+              <w:t xml:space="preserve">line from schema.prisma (section 9)</w:t>
             </w:r>
           </w:p>
         </w:tc>
@@ -3108,10 +3243,7 @@
               <w:jc w:val="left"/>
             </w:pPr>
             <w:r>
-              <w:rPr>
-                <w:rStyle w:val="VerbatimChar"/>
-              </w:rPr>
-              <w:t xml:space="preserve">next.config.js</w:t>
+              <w:t xml:space="preserve">⚙️ next.config.js</w:t>
             </w:r>
           </w:p>
         </w:tc>
@@ -3123,7 +3255,7 @@
               <w:jc w:val="left"/>
             </w:pPr>
             <w:r>
-              <w:t xml:space="preserve">Abacus build flags</w:t>
+              <w:t xml:space="preserve">Needs simplify</w:t>
             </w:r>
           </w:p>
         </w:tc>
@@ -3135,48 +3267,7 @@
               <w:jc w:val="left"/>
             </w:pPr>
             <w:r>
-              <w:t xml:space="preserve">Simplified standard config</w:t>
-            </w:r>
-          </w:p>
-        </w:tc>
-      </w:tr>
-      <w:tr>
-        <w:tc>
-          <w:tcPr/>
-          <w:p>
-            <w:pPr>
-              <w:pStyle w:val="Compact"/>
-              <w:jc w:val="left"/>
-            </w:pPr>
-            <w:r>
-              <w:t xml:space="preserve">Layout script</w:t>
-            </w:r>
-          </w:p>
-        </w:tc>
-        <w:tc>
-          <w:tcPr/>
-          <w:p>
-            <w:pPr>
-              <w:pStyle w:val="Compact"/>
-              <w:jc w:val="left"/>
-            </w:pPr>
-            <w:r>
-              <w:rPr>
-                <w:rStyle w:val="VerbatimChar"/>
-              </w:rPr>
-              <w:t xml:space="preserve">appllm-lib.js</w:t>
-            </w:r>
-          </w:p>
-        </w:tc>
-        <w:tc>
-          <w:tcPr/>
-          <w:p>
-            <w:pPr>
-              <w:pStyle w:val="Compact"/>
-              <w:jc w:val="left"/>
-            </w:pPr>
-            <w:r>
-              <w:t xml:space="preserve">Remove</w:t>
+              <w:t xml:space="preserve">Replace with clean version (section 10)</w:t>
             </w:r>
           </w:p>
         </w:tc>

</xml_diff>

<commit_message>
Rebrand: Health Logger → WellnessLog.in
- All user-facing text, metadata, manifest, service worker
- Email templates: Health Summary → Wellness Summary
- System prompt: WellnessLog persona
- Self-hosting guide updated
- Project instructions updated
</commit_message>
<xml_diff>
--- a/SELF_HOSTING_GUIDE.docx
+++ b/SELF_HOSTING_GUIDE.docx
@@ -2,13 +2,13 @@
 <file path=word/document.xml><?xml version="1.0" encoding="utf-8"?>
 <w:document xmlns:w="http://schemas.openxmlformats.org/wordprocessingml/2006/main" xmlns:m="http://schemas.openxmlformats.org/officeDocument/2006/math" xmlns:r="http://schemas.openxmlformats.org/officeDocument/2006/relationships" xmlns:o="urn:schemas-microsoft-com:office:office" xmlns:v="urn:schemas-microsoft-com:vml" xmlns:w10="urn:schemas-microsoft-com:office:word" xmlns:a="http://schemas.openxmlformats.org/drawingml/2006/main" xmlns:pic="http://schemas.openxmlformats.org/drawingml/2006/picture" xmlns:wp="http://schemas.openxmlformats.org/drawingml/2006/wordprocessingDrawing">
   <w:body>
-    <w:bookmarkStart w:id="38" w:name="X86b893c4ccdfd50ac08838a4a594088d5c89b0e"/>
+    <w:bookmarkStart w:id="38" w:name="X0d7d3b4366ac9275364dede10f826a71458c917"/>
     <w:p>
       <w:pPr>
         <w:pStyle w:val="Heading1"/>
       </w:pPr>
       <w:r>
-        <w:t xml:space="preserve">Health Logger — Self-Hosting Guide (Hostinger VPS)</w:t>
+        <w:t xml:space="preserve">WellnessLog.in — Self-Hosting Guide (Hostinger VPS)</w:t>
       </w:r>
     </w:p>
     <w:p>
@@ -16,7 +16,7 @@
         <w:pStyle w:val="FirstParagraph"/>
       </w:pPr>
       <w:r>
-        <w:t xml:space="preserve">This guide walks you through deploying the Health Logger app on your own Hostinger VPS with your custom domain.</w:t>
+        <w:t xml:space="preserve">This guide walks you through deploying the WellnessLog.in app on your own Hostinger VPS with your custom domain.</w:t>
       </w:r>
     </w:p>
     <w:p>

</xml_diff>